<commit_message>
TS 6.5 Kramam Jatai compare Tamil and Sanskrit
</commit_message>
<xml_diff>
--- a/TS-Kramam/TS-6.5/TS 6.5 Sanskrit Krama Paatam Corrections.docx
+++ b/TS-Kramam/TS-6.5/TS 6.5 Sanskrit Krama Paatam Corrections.docx
@@ -1,6 +1,6 @@
 
 <file path=word/document.xml><?xml version="1.0" encoding="utf-8"?>
-<w:document xmlns:wpc="http://schemas.microsoft.com/office/word/2010/wordprocessingCanvas" xmlns:cx="http://schemas.microsoft.com/office/drawing/2014/chartex" xmlns:cx1="http://schemas.microsoft.com/office/drawing/2015/9/8/chartex" xmlns:mc="http://schemas.openxmlformats.org/markup-compatibility/2006" xmlns:o="urn:schemas-microsoft-com:office:office" xmlns:r="http://schemas.openxmlformats.org/officeDocument/2006/relationships" xmlns:m="http://schemas.openxmlformats.org/officeDocument/2006/math" xmlns:v="urn:schemas-microsoft-com:vml" xmlns:wp14="http://schemas.microsoft.com/office/word/2010/wordprocessingDrawing" xmlns:wp="http://schemas.openxmlformats.org/drawingml/2006/wordprocessingDrawing" xmlns:w10="urn:schemas-microsoft-com:office:word" xmlns:w="http://schemas.openxmlformats.org/wordprocessingml/2006/main" xmlns:w14="http://schemas.microsoft.com/office/word/2010/wordml" xmlns:w15="http://schemas.microsoft.com/office/word/2012/wordml" xmlns:w16se="http://schemas.microsoft.com/office/word/2015/wordml/symex" xmlns:wpg="http://schemas.microsoft.com/office/word/2010/wordprocessingGroup" xmlns:wpi="http://schemas.microsoft.com/office/word/2010/wordprocessingInk" xmlns:wne="http://schemas.microsoft.com/office/word/2006/wordml" xmlns:wps="http://schemas.microsoft.com/office/word/2010/wordprocessingShape" mc:Ignorable="w14 w15 w16se wp14">
+<w:document xmlns:wpc="http://schemas.microsoft.com/office/word/2010/wordprocessingCanvas" xmlns:cx="http://schemas.microsoft.com/office/drawing/2014/chartex" xmlns:cx1="http://schemas.microsoft.com/office/drawing/2015/9/8/chartex" xmlns:cx2="http://schemas.microsoft.com/office/drawing/2015/10/21/chartex" xmlns:cx3="http://schemas.microsoft.com/office/drawing/2016/5/9/chartex" xmlns:cx4="http://schemas.microsoft.com/office/drawing/2016/5/10/chartex" xmlns:cx5="http://schemas.microsoft.com/office/drawing/2016/5/11/chartex" xmlns:cx6="http://schemas.microsoft.com/office/drawing/2016/5/12/chartex" xmlns:cx7="http://schemas.microsoft.com/office/drawing/2016/5/13/chartex" xmlns:cx8="http://schemas.microsoft.com/office/drawing/2016/5/14/chartex" xmlns:mc="http://schemas.openxmlformats.org/markup-compatibility/2006" xmlns:aink="http://schemas.microsoft.com/office/drawing/2016/ink" xmlns:am3d="http://schemas.microsoft.com/office/drawing/2017/model3d" xmlns:o="urn:schemas-microsoft-com:office:office" xmlns:oel="http://schemas.microsoft.com/office/2019/extlst" xmlns:r="http://schemas.openxmlformats.org/officeDocument/2006/relationships" xmlns:m="http://schemas.openxmlformats.org/officeDocument/2006/math" xmlns:v="urn:schemas-microsoft-com:vml" xmlns:wp14="http://schemas.microsoft.com/office/word/2010/wordprocessingDrawing" xmlns:wp="http://schemas.openxmlformats.org/drawingml/2006/wordprocessingDrawing" xmlns:w10="urn:schemas-microsoft-com:office:word" xmlns:w="http://schemas.openxmlformats.org/wordprocessingml/2006/main" xmlns:w14="http://schemas.microsoft.com/office/word/2010/wordml" xmlns:w15="http://schemas.microsoft.com/office/word/2012/wordml" xmlns:w16cex="http://schemas.microsoft.com/office/word/2018/wordml/cex" xmlns:w16cid="http://schemas.microsoft.com/office/word/2016/wordml/cid" xmlns:w16="http://schemas.microsoft.com/office/word/2018/wordml" xmlns:w16du="http://schemas.microsoft.com/office/word/2023/wordml/word16du" xmlns:w16sdtdh="http://schemas.microsoft.com/office/word/2020/wordml/sdtdatahash" xmlns:w16sdtfl="http://schemas.microsoft.com/office/word/2024/wordml/sdtformatlock" xmlns:w16se="http://schemas.microsoft.com/office/word/2015/wordml/symex" xmlns:wpg="http://schemas.microsoft.com/office/word/2010/wordprocessingGroup" xmlns:wpi="http://schemas.microsoft.com/office/word/2010/wordprocessingInk" xmlns:wne="http://schemas.microsoft.com/office/word/2006/wordml" xmlns:wps="http://schemas.microsoft.com/office/word/2010/wordprocessingShape" mc:Ignorable="w14 w15 w16se w16cid w16 w16cex w16sdtdh w16sdtfl w16du wp14">
   <w:body>
     <w:p>
       <w:pPr>
@@ -23,7 +23,6 @@
         </w:rPr>
         <w:t xml:space="preserve">TS </w:t>
       </w:r>
-      <w:proofErr w:type="spellStart"/>
       <w:r>
         <w:rPr>
           <w:b/>
@@ -34,7 +33,36 @@
         </w:rPr>
         <w:t>Krama</w:t>
       </w:r>
-      <w:proofErr w:type="spellEnd"/>
+      <w:r>
+        <w:rPr>
+          <w:b/>
+          <w:bCs/>
+          <w:sz w:val="32"/>
+          <w:szCs w:val="32"/>
+          <w:u w:val="single"/>
+        </w:rPr>
+        <w:t xml:space="preserve"> Paatam – TS </w:t>
+      </w:r>
+      <w:r>
+        <w:rPr>
+          <w:b/>
+          <w:bCs/>
+          <w:sz w:val="32"/>
+          <w:szCs w:val="32"/>
+          <w:u w:val="single"/>
+        </w:rPr>
+        <w:t>6.5 Sanskrit</w:t>
+      </w:r>
+      <w:r>
+        <w:rPr>
+          <w:b/>
+          <w:bCs/>
+          <w:sz w:val="32"/>
+          <w:szCs w:val="32"/>
+          <w:u w:val="single"/>
+        </w:rPr>
+        <w:t xml:space="preserve"> Corrections –</w:t>
+      </w:r>
       <w:r>
         <w:rPr>
           <w:b/>
@@ -45,7 +73,6 @@
         </w:rPr>
         <w:t xml:space="preserve"> </w:t>
       </w:r>
-      <w:proofErr w:type="spellStart"/>
       <w:r>
         <w:rPr>
           <w:b/>
@@ -54,9 +81,671 @@
           <w:szCs w:val="32"/>
           <w:u w:val="single"/>
         </w:rPr>
-        <w:t>Paatam</w:t>
+        <w:t xml:space="preserve">Observed till </w:t>
+      </w:r>
+      <w:proofErr w:type="spellStart"/>
+      <w:r>
+        <w:rPr>
+          <w:b/>
+          <w:bCs/>
+          <w:color w:val="EE0000"/>
+          <w:sz w:val="32"/>
+          <w:szCs w:val="32"/>
+          <w:highlight w:val="yellow"/>
+          <w:u w:val="single"/>
+        </w:rPr>
+        <w:t>xxxxxxxxx</w:t>
       </w:r>
       <w:proofErr w:type="spellEnd"/>
+    </w:p>
+    <w:p>
+      <w:pPr>
+        <w:jc w:val="center"/>
+        <w:rPr>
+          <w:b/>
+          <w:bCs/>
+        </w:rPr>
+      </w:pPr>
+      <w:r>
+        <w:rPr>
+          <w:b/>
+          <w:bCs/>
+        </w:rPr>
+        <w:t>(ignore those which are already incorporated in your book’s version and date)</w:t>
+      </w:r>
+    </w:p>
+    <w:tbl>
+      <w:tblPr>
+        <w:tblW w:w="13835" w:type="dxa"/>
+        <w:tblInd w:w="-792" w:type="dxa"/>
+        <w:tblBorders>
+          <w:top w:val="single" w:sz="4" w:space="0" w:color="000000"/>
+          <w:left w:val="single" w:sz="4" w:space="0" w:color="000000"/>
+          <w:bottom w:val="single" w:sz="4" w:space="0" w:color="000000"/>
+          <w:right w:val="single" w:sz="4" w:space="0" w:color="000000"/>
+          <w:insideH w:val="single" w:sz="4" w:space="0" w:color="000000"/>
+          <w:insideV w:val="single" w:sz="4" w:space="0" w:color="000000"/>
+        </w:tblBorders>
+        <w:tblLook w:val="04A0" w:firstRow="1" w:lastRow="0" w:firstColumn="1" w:lastColumn="0" w:noHBand="0" w:noVBand="1"/>
+      </w:tblPr>
+      <w:tblGrid>
+        <w:gridCol w:w="3877"/>
+        <w:gridCol w:w="4738"/>
+        <w:gridCol w:w="5220"/>
+      </w:tblGrid>
+      <w:tr>
+        <w:tc>
+          <w:tcPr>
+            <w:tcW w:w="3877" w:type="dxa"/>
+          </w:tcPr>
+          <w:p>
+            <w:pPr>
+              <w:spacing w:before="0" w:line="240" w:lineRule="auto"/>
+              <w:jc w:val="center"/>
+              <w:rPr>
+                <w:b/>
+                <w:bCs/>
+                <w:sz w:val="32"/>
+                <w:szCs w:val="32"/>
+              </w:rPr>
+            </w:pPr>
+            <w:r>
+              <w:rPr>
+                <w:b/>
+                <w:bCs/>
+                <w:sz w:val="32"/>
+                <w:szCs w:val="32"/>
+              </w:rPr>
+              <w:t>Section, Paragraph</w:t>
+            </w:r>
+          </w:p>
+          <w:p>
+            <w:pPr>
+              <w:spacing w:before="0" w:line="240" w:lineRule="auto"/>
+              <w:jc w:val="center"/>
+              <w:rPr>
+                <w:b/>
+                <w:bCs/>
+                <w:sz w:val="32"/>
+                <w:szCs w:val="32"/>
+              </w:rPr>
+            </w:pPr>
+            <w:r>
+              <w:rPr>
+                <w:b/>
+                <w:bCs/>
+                <w:sz w:val="32"/>
+                <w:szCs w:val="32"/>
+              </w:rPr>
+              <w:t>Reference</w:t>
+            </w:r>
+          </w:p>
+        </w:tc>
+        <w:tc>
+          <w:tcPr>
+            <w:tcW w:w="4738" w:type="dxa"/>
+          </w:tcPr>
+          <w:p>
+            <w:pPr>
+              <w:spacing w:before="0" w:line="240" w:lineRule="auto"/>
+              <w:jc w:val="center"/>
+              <w:rPr>
+                <w:b/>
+                <w:bCs/>
+                <w:sz w:val="32"/>
+                <w:szCs w:val="32"/>
+              </w:rPr>
+            </w:pPr>
+            <w:r>
+              <w:rPr>
+                <w:b/>
+                <w:bCs/>
+                <w:sz w:val="32"/>
+                <w:szCs w:val="32"/>
+              </w:rPr>
+              <w:t>As Printed</w:t>
+            </w:r>
+          </w:p>
+        </w:tc>
+        <w:tc>
+          <w:tcPr>
+            <w:tcW w:w="5220" w:type="dxa"/>
+          </w:tcPr>
+          <w:p>
+            <w:pPr>
+              <w:spacing w:before="0" w:line="240" w:lineRule="auto"/>
+              <w:ind w:right="-18"/>
+              <w:jc w:val="center"/>
+              <w:rPr>
+                <w:b/>
+                <w:bCs/>
+                <w:sz w:val="32"/>
+                <w:szCs w:val="32"/>
+              </w:rPr>
+            </w:pPr>
+            <w:r>
+              <w:rPr>
+                <w:b/>
+                <w:bCs/>
+                <w:sz w:val="32"/>
+                <w:szCs w:val="32"/>
+              </w:rPr>
+              <w:t>To be read as or corrected as</w:t>
+            </w:r>
+          </w:p>
+        </w:tc>
+      </w:tr>
+      <w:tr>
+        <w:trPr>
+          <w:trHeight w:val="1091"/>
+        </w:trPr>
+        <w:tc>
+          <w:tcPr>
+            <w:tcW w:w="3877" w:type="dxa"/>
+          </w:tcPr>
+          <w:p>
+            <w:pPr>
+              <w:widowControl w:val="0"/>
+              <w:tabs>
+                <w:tab w:val="left" w:pos="993"/>
+              </w:tabs>
+              <w:autoSpaceDE w:val="0"/>
+              <w:autoSpaceDN w:val="0"/>
+              <w:adjustRightInd w:val="0"/>
+              <w:spacing w:before="0" w:line="252" w:lineRule="auto"/>
+              <w:ind w:right="297"/>
+              <w:rPr>
+                <w:rFonts w:cs="Arial"/>
+                <w:b/>
+                <w:sz w:val="28"/>
+                <w:szCs w:val="28"/>
+              </w:rPr>
+            </w:pPr>
+            <w:r>
+              <w:rPr>
+                <w:rFonts w:cs="Arial"/>
+                <w:b/>
+                <w:sz w:val="28"/>
+                <w:szCs w:val="28"/>
+              </w:rPr>
+              <w:t>T.S.6.5.2.2 – Kramam</w:t>
+            </w:r>
+          </w:p>
+          <w:p>
+            <w:pPr>
+              <w:widowControl w:val="0"/>
+              <w:tabs>
+                <w:tab w:val="left" w:pos="993"/>
+              </w:tabs>
+              <w:autoSpaceDE w:val="0"/>
+              <w:autoSpaceDN w:val="0"/>
+              <w:adjustRightInd w:val="0"/>
+              <w:spacing w:before="0" w:line="252" w:lineRule="auto"/>
+              <w:ind w:right="297"/>
+              <w:rPr>
+                <w:rFonts w:cs="Arial"/>
+                <w:b/>
+                <w:sz w:val="28"/>
+                <w:szCs w:val="28"/>
+              </w:rPr>
+            </w:pPr>
+            <w:r>
+              <w:rPr>
+                <w:rFonts w:cs="Arial"/>
+                <w:b/>
+                <w:sz w:val="28"/>
+                <w:szCs w:val="28"/>
+              </w:rPr>
+              <w:t xml:space="preserve">Krama Vaakyam No.– </w:t>
+            </w:r>
+            <w:r>
+              <w:rPr>
+                <w:rFonts w:cs="Arial"/>
+                <w:b/>
+                <w:sz w:val="28"/>
+                <w:szCs w:val="28"/>
+              </w:rPr>
+              <w:t>38</w:t>
+            </w:r>
+          </w:p>
+          <w:p>
+            <w:pPr>
+              <w:widowControl w:val="0"/>
+              <w:tabs>
+                <w:tab w:val="left" w:pos="993"/>
+              </w:tabs>
+              <w:autoSpaceDE w:val="0"/>
+              <w:autoSpaceDN w:val="0"/>
+              <w:adjustRightInd w:val="0"/>
+              <w:spacing w:before="0" w:line="252" w:lineRule="auto"/>
+              <w:ind w:right="297"/>
+              <w:rPr>
+                <w:rFonts w:cs="Arial"/>
+                <w:b/>
+                <w:sz w:val="28"/>
+                <w:szCs w:val="32"/>
+              </w:rPr>
+            </w:pPr>
+            <w:r>
+              <w:rPr>
+                <w:rFonts w:cs="Arial"/>
+                <w:b/>
+                <w:sz w:val="28"/>
+                <w:szCs w:val="28"/>
+              </w:rPr>
+              <w:t>Panchaati No. - 7</w:t>
+            </w:r>
+          </w:p>
+        </w:tc>
+        <w:tc>
+          <w:tcPr>
+            <w:tcW w:w="4738" w:type="dxa"/>
+          </w:tcPr>
+          <w:p>
+            <w:pPr>
+              <w:widowControl w:val="0"/>
+              <w:autoSpaceDE w:val="0"/>
+              <w:autoSpaceDN w:val="0"/>
+              <w:adjustRightInd w:val="0"/>
+              <w:spacing w:line="252" w:lineRule="auto"/>
+              <w:rPr>
+                <w:rFonts w:ascii="BRH Devanagari Extra" w:hAnsi="BRH Devanagari Extra" w:cs="BRH Devanagari Extra"/>
+                <w:sz w:val="40"/>
+                <w:szCs w:val="40"/>
+              </w:rPr>
+            </w:pPr>
+            <w:proofErr w:type="spellStart"/>
+            <w:r>
+              <w:rPr>
+                <w:rFonts w:ascii="BRH Devanagari Extra" w:hAnsi="BRH Devanagari Extra" w:cs="BRH Devanagari Extra"/>
+                <w:sz w:val="40"/>
+                <w:szCs w:val="40"/>
+              </w:rPr>
+              <w:t>kÉëÑ</w:t>
+            </w:r>
+            <w:proofErr w:type="spellEnd"/>
+            <w:r>
+              <w:rPr>
+                <w:rFonts w:ascii="BRH Malayalam Extra" w:hAnsi="BRH Malayalam Extra" w:cs="BRH Devanagari Extra"/>
+                <w:b/>
+                <w:sz w:val="32"/>
+                <w:szCs w:val="40"/>
+              </w:rPr>
+              <w:t>–</w:t>
+            </w:r>
+            <w:proofErr w:type="spellStart"/>
+            <w:r>
+              <w:rPr>
+                <w:rFonts w:ascii="BRH Devanagari Extra" w:hAnsi="BRH Devanagari Extra" w:cs="BRH Devanagari Extra"/>
+                <w:sz w:val="40"/>
+                <w:szCs w:val="40"/>
+              </w:rPr>
+              <w:t>uÉxrÉþ</w:t>
+            </w:r>
+            <w:proofErr w:type="spellEnd"/>
+            <w:r>
+              <w:rPr>
+                <w:rFonts w:ascii="BRH Devanagari Extra" w:hAnsi="BRH Devanagari Extra" w:cs="BRH Devanagari Extra"/>
+                <w:sz w:val="40"/>
+                <w:szCs w:val="40"/>
+              </w:rPr>
+              <w:t xml:space="preserve"> </w:t>
+            </w:r>
+            <w:proofErr w:type="spellStart"/>
+            <w:r>
+              <w:rPr>
+                <w:rFonts w:ascii="BRH Devanagari Extra" w:hAnsi="BRH Devanagari Extra" w:cs="BRH Devanagari Extra"/>
+                <w:sz w:val="40"/>
+                <w:szCs w:val="40"/>
+              </w:rPr>
+              <w:t>kÉëÑuÉ</w:t>
+            </w:r>
+            <w:proofErr w:type="spellEnd"/>
+            <w:r>
+              <w:rPr>
+                <w:rFonts w:ascii="BRH Malayalam Extra" w:hAnsi="BRH Malayalam Extra" w:cs="BRH Devanagari Extra"/>
+                <w:b/>
+                <w:sz w:val="32"/>
+                <w:szCs w:val="40"/>
+              </w:rPr>
+              <w:t>–</w:t>
+            </w:r>
+            <w:proofErr w:type="spellStart"/>
+            <w:r>
+              <w:rPr>
+                <w:rFonts w:ascii="BRH Devanagari Extra" w:hAnsi="BRH Devanagari Extra" w:cs="BRH Devanagari Extra"/>
+                <w:sz w:val="40"/>
+                <w:szCs w:val="40"/>
+              </w:rPr>
+              <w:t>iuÉqÉç</w:t>
+            </w:r>
+            <w:proofErr w:type="spellEnd"/>
+            <w:r>
+              <w:rPr>
+                <w:rFonts w:ascii="BRH Devanagari Extra" w:hAnsi="BRH Devanagari Extra" w:cs="BRH Devanagari Extra"/>
+                <w:sz w:val="40"/>
+                <w:szCs w:val="40"/>
+              </w:rPr>
+              <w:t xml:space="preserve"> |</w:t>
+            </w:r>
+            <w:r>
+              <w:rPr>
+                <w:rFonts w:ascii="BRH Devanagari Extra" w:hAnsi="BRH Devanagari Extra" w:cs="BRH Devanagari Extra"/>
+                <w:sz w:val="40"/>
+                <w:szCs w:val="40"/>
+              </w:rPr>
+              <w:t xml:space="preserve"> </w:t>
+            </w:r>
+          </w:p>
+          <w:p>
+            <w:pPr>
+              <w:widowControl w:val="0"/>
+              <w:autoSpaceDE w:val="0"/>
+              <w:autoSpaceDN w:val="0"/>
+              <w:adjustRightInd w:val="0"/>
+              <w:spacing w:before="0" w:line="240" w:lineRule="auto"/>
+              <w:rPr>
+                <w:rFonts w:ascii="BRH Malayalam Extra" w:eastAsia="Times New Roman" w:hAnsi="BRH Malayalam Extra" w:cs="BRH Malayalam Extra"/>
+                <w:color w:val="000000"/>
+                <w:sz w:val="40"/>
+                <w:szCs w:val="40"/>
+                <w:lang w:val="en-IN" w:eastAsia="en-IN" w:bidi="ml-IN"/>
+              </w:rPr>
+            </w:pPr>
+            <w:proofErr w:type="spellStart"/>
+            <w:r>
+              <w:rPr>
+                <w:rFonts w:ascii="BRH Devanagari Extra" w:hAnsi="BRH Devanagari Extra" w:cs="BRH Devanagari Extra"/>
+                <w:color w:val="EE0000"/>
+                <w:sz w:val="40"/>
+                <w:szCs w:val="40"/>
+                <w:highlight w:val="yellow"/>
+              </w:rPr>
+              <w:t>kÉÑ</w:t>
+            </w:r>
+            <w:proofErr w:type="spellEnd"/>
+            <w:r>
+              <w:rPr>
+                <w:rFonts w:ascii="BRH Malayalam Extra" w:hAnsi="BRH Malayalam Extra" w:cs="BRH Devanagari Extra"/>
+                <w:b/>
+                <w:color w:val="EE0000"/>
+                <w:sz w:val="32"/>
+                <w:szCs w:val="40"/>
+                <w:highlight w:val="yellow"/>
+              </w:rPr>
+              <w:t>–</w:t>
+            </w:r>
+            <w:r>
+              <w:rPr>
+                <w:rFonts w:ascii="BRH Devanagari Extra" w:hAnsi="BRH Devanagari Extra" w:cs="BRH Devanagari Extra"/>
+                <w:sz w:val="40"/>
+                <w:szCs w:val="40"/>
+              </w:rPr>
+              <w:t>uÉ</w:t>
+            </w:r>
+            <w:r>
+              <w:rPr>
+                <w:rFonts w:ascii="BRH Malayalam Extra" w:hAnsi="BRH Malayalam Extra" w:cs="BRH Devanagari Extra"/>
+                <w:b/>
+                <w:sz w:val="32"/>
+                <w:szCs w:val="40"/>
+              </w:rPr>
+              <w:t>–</w:t>
+            </w:r>
+            <w:proofErr w:type="spellStart"/>
+            <w:r>
+              <w:rPr>
+                <w:rFonts w:ascii="BRH Devanagari Extra" w:hAnsi="BRH Devanagari Extra" w:cs="BRH Devanagari Extra"/>
+                <w:sz w:val="40"/>
+                <w:szCs w:val="40"/>
+              </w:rPr>
+              <w:t>iuÉqÉç</w:t>
+            </w:r>
+            <w:proofErr w:type="spellEnd"/>
+            <w:r>
+              <w:rPr>
+                <w:rFonts w:ascii="BRH Devanagari Extra" w:hAnsi="BRH Devanagari Extra" w:cs="BRH Devanagari Extra"/>
+                <w:sz w:val="40"/>
+                <w:szCs w:val="40"/>
+              </w:rPr>
+              <w:t xml:space="preserve"> </w:t>
+            </w:r>
+            <w:proofErr w:type="spellStart"/>
+            <w:r>
+              <w:rPr>
+                <w:rFonts w:ascii="BRH Devanagari Extra" w:hAnsi="BRH Devanagari Extra" w:cs="BRH Devanagari Extra"/>
+                <w:sz w:val="40"/>
+                <w:szCs w:val="40"/>
+              </w:rPr>
+              <w:t>ÆrÉiÉç</w:t>
+            </w:r>
+            <w:proofErr w:type="spellEnd"/>
+            <w:r>
+              <w:rPr>
+                <w:rFonts w:ascii="BRH Devanagari Extra" w:hAnsi="BRH Devanagari Extra" w:cs="BRH Devanagari Extra"/>
+                <w:sz w:val="40"/>
+                <w:szCs w:val="40"/>
+              </w:rPr>
+              <w:t xml:space="preserve"> |</w:t>
+            </w:r>
+          </w:p>
+        </w:tc>
+        <w:tc>
+          <w:tcPr>
+            <w:tcW w:w="5220" w:type="dxa"/>
+          </w:tcPr>
+          <w:p>
+            <w:pPr>
+              <w:widowControl w:val="0"/>
+              <w:autoSpaceDE w:val="0"/>
+              <w:autoSpaceDN w:val="0"/>
+              <w:adjustRightInd w:val="0"/>
+              <w:spacing w:line="252" w:lineRule="auto"/>
+              <w:rPr>
+                <w:rFonts w:ascii="BRH Devanagari Extra" w:hAnsi="BRH Devanagari Extra" w:cs="BRH Devanagari Extra"/>
+                <w:sz w:val="40"/>
+                <w:szCs w:val="40"/>
+              </w:rPr>
+            </w:pPr>
+            <w:proofErr w:type="spellStart"/>
+            <w:r>
+              <w:rPr>
+                <w:rFonts w:ascii="BRH Devanagari Extra" w:hAnsi="BRH Devanagari Extra" w:cs="BRH Devanagari Extra"/>
+                <w:sz w:val="40"/>
+                <w:szCs w:val="40"/>
+              </w:rPr>
+              <w:t>kÉëÑ</w:t>
+            </w:r>
+            <w:proofErr w:type="spellEnd"/>
+            <w:r>
+              <w:rPr>
+                <w:rFonts w:ascii="BRH Malayalam Extra" w:hAnsi="BRH Malayalam Extra" w:cs="BRH Devanagari Extra"/>
+                <w:b/>
+                <w:sz w:val="32"/>
+                <w:szCs w:val="40"/>
+              </w:rPr>
+              <w:t>–</w:t>
+            </w:r>
+            <w:proofErr w:type="spellStart"/>
+            <w:r>
+              <w:rPr>
+                <w:rFonts w:ascii="BRH Devanagari Extra" w:hAnsi="BRH Devanagari Extra" w:cs="BRH Devanagari Extra"/>
+                <w:sz w:val="40"/>
+                <w:szCs w:val="40"/>
+              </w:rPr>
+              <w:t>uÉxrÉþ</w:t>
+            </w:r>
+            <w:proofErr w:type="spellEnd"/>
+            <w:r>
+              <w:rPr>
+                <w:rFonts w:ascii="BRH Devanagari Extra" w:hAnsi="BRH Devanagari Extra" w:cs="BRH Devanagari Extra"/>
+                <w:sz w:val="40"/>
+                <w:szCs w:val="40"/>
+              </w:rPr>
+              <w:t xml:space="preserve"> </w:t>
+            </w:r>
+            <w:proofErr w:type="spellStart"/>
+            <w:r>
+              <w:rPr>
+                <w:rFonts w:ascii="BRH Devanagari Extra" w:hAnsi="BRH Devanagari Extra" w:cs="BRH Devanagari Extra"/>
+                <w:sz w:val="40"/>
+                <w:szCs w:val="40"/>
+              </w:rPr>
+              <w:t>kÉëÑuÉ</w:t>
+            </w:r>
+            <w:proofErr w:type="spellEnd"/>
+            <w:r>
+              <w:rPr>
+                <w:rFonts w:ascii="BRH Malayalam Extra" w:hAnsi="BRH Malayalam Extra" w:cs="BRH Devanagari Extra"/>
+                <w:b/>
+                <w:sz w:val="32"/>
+                <w:szCs w:val="40"/>
+              </w:rPr>
+              <w:t>–</w:t>
+            </w:r>
+            <w:proofErr w:type="spellStart"/>
+            <w:r>
+              <w:rPr>
+                <w:rFonts w:ascii="BRH Devanagari Extra" w:hAnsi="BRH Devanagari Extra" w:cs="BRH Devanagari Extra"/>
+                <w:sz w:val="40"/>
+                <w:szCs w:val="40"/>
+              </w:rPr>
+              <w:t>iuÉqÉç</w:t>
+            </w:r>
+            <w:proofErr w:type="spellEnd"/>
+            <w:r>
+              <w:rPr>
+                <w:rFonts w:ascii="BRH Devanagari Extra" w:hAnsi="BRH Devanagari Extra" w:cs="BRH Devanagari Extra"/>
+                <w:sz w:val="40"/>
+                <w:szCs w:val="40"/>
+              </w:rPr>
+              <w:t xml:space="preserve"> |</w:t>
+            </w:r>
+            <w:r>
+              <w:rPr>
+                <w:rFonts w:ascii="BRH Devanagari Extra" w:hAnsi="BRH Devanagari Extra" w:cs="BRH Devanagari Extra"/>
+                <w:sz w:val="40"/>
+                <w:szCs w:val="40"/>
+              </w:rPr>
+              <w:t xml:space="preserve"> </w:t>
+            </w:r>
+          </w:p>
+          <w:p>
+            <w:pPr>
+              <w:widowControl w:val="0"/>
+              <w:autoSpaceDE w:val="0"/>
+              <w:autoSpaceDN w:val="0"/>
+              <w:adjustRightInd w:val="0"/>
+              <w:spacing w:before="0" w:line="240" w:lineRule="auto"/>
+              <w:rPr>
+                <w:rFonts w:ascii="BRH Devanagari Extra" w:hAnsi="BRH Devanagari Extra" w:cs="BRH Devanagari Extra"/>
+                <w:sz w:val="40"/>
+                <w:szCs w:val="40"/>
+              </w:rPr>
+            </w:pPr>
+            <w:proofErr w:type="spellStart"/>
+            <w:r>
+              <w:rPr>
+                <w:rFonts w:ascii="BRH Devanagari Extra" w:hAnsi="BRH Devanagari Extra" w:cs="BRH Devanagari Extra"/>
+                <w:sz w:val="40"/>
+                <w:szCs w:val="40"/>
+              </w:rPr>
+              <w:t>kÉëÑ</w:t>
+            </w:r>
+            <w:proofErr w:type="spellEnd"/>
+            <w:r>
+              <w:rPr>
+                <w:rFonts w:ascii="BRH Malayalam Extra" w:hAnsi="BRH Malayalam Extra" w:cs="BRH Devanagari Extra"/>
+                <w:b/>
+                <w:sz w:val="32"/>
+                <w:szCs w:val="40"/>
+              </w:rPr>
+              <w:t>–</w:t>
+            </w:r>
+            <w:r>
+              <w:rPr>
+                <w:rFonts w:ascii="BRH Devanagari Extra" w:hAnsi="BRH Devanagari Extra" w:cs="BRH Devanagari Extra"/>
+                <w:sz w:val="40"/>
+                <w:szCs w:val="40"/>
+              </w:rPr>
+              <w:t>uÉ</w:t>
+            </w:r>
+            <w:r>
+              <w:rPr>
+                <w:rFonts w:ascii="BRH Malayalam Extra" w:hAnsi="BRH Malayalam Extra" w:cs="BRH Devanagari Extra"/>
+                <w:b/>
+                <w:sz w:val="32"/>
+                <w:szCs w:val="40"/>
+              </w:rPr>
+              <w:t>–</w:t>
+            </w:r>
+            <w:proofErr w:type="spellStart"/>
+            <w:r>
+              <w:rPr>
+                <w:rFonts w:ascii="BRH Devanagari Extra" w:hAnsi="BRH Devanagari Extra" w:cs="BRH Devanagari Extra"/>
+                <w:sz w:val="40"/>
+                <w:szCs w:val="40"/>
+              </w:rPr>
+              <w:t>iuÉqÉç</w:t>
+            </w:r>
+            <w:proofErr w:type="spellEnd"/>
+            <w:r>
+              <w:rPr>
+                <w:rFonts w:ascii="BRH Devanagari Extra" w:hAnsi="BRH Devanagari Extra" w:cs="BRH Devanagari Extra"/>
+                <w:sz w:val="40"/>
+                <w:szCs w:val="40"/>
+              </w:rPr>
+              <w:t xml:space="preserve"> </w:t>
+            </w:r>
+            <w:proofErr w:type="spellStart"/>
+            <w:r>
+              <w:rPr>
+                <w:rFonts w:ascii="BRH Devanagari Extra" w:hAnsi="BRH Devanagari Extra" w:cs="BRH Devanagari Extra"/>
+                <w:sz w:val="40"/>
+                <w:szCs w:val="40"/>
+              </w:rPr>
+              <w:t>ÆrÉiÉç</w:t>
+            </w:r>
+            <w:proofErr w:type="spellEnd"/>
+            <w:r>
+              <w:rPr>
+                <w:rFonts w:ascii="BRH Devanagari Extra" w:hAnsi="BRH Devanagari Extra" w:cs="BRH Devanagari Extra"/>
+                <w:sz w:val="40"/>
+                <w:szCs w:val="40"/>
+              </w:rPr>
+              <w:t xml:space="preserve"> |</w:t>
+            </w:r>
+          </w:p>
+          <w:p>
+            <w:pPr>
+              <w:widowControl w:val="0"/>
+              <w:autoSpaceDE w:val="0"/>
+              <w:autoSpaceDN w:val="0"/>
+              <w:adjustRightInd w:val="0"/>
+              <w:spacing w:before="0" w:line="240" w:lineRule="auto"/>
+              <w:rPr>
+                <w:rFonts w:ascii="BRH Malayalam Extra" w:eastAsia="Times New Roman" w:hAnsi="BRH Malayalam Extra" w:cs="BRH Malayalam Extra"/>
+                <w:color w:val="000000"/>
+                <w:sz w:val="40"/>
+                <w:szCs w:val="40"/>
+                <w:lang w:val="en-IN" w:eastAsia="en-IN" w:bidi="ml-IN"/>
+              </w:rPr>
+            </w:pPr>
+          </w:p>
+        </w:tc>
+      </w:tr>
+    </w:tbl>
+    <w:p>
+      <w:pPr>
+        <w:jc w:val="center"/>
+        <w:rPr>
+          <w:b/>
+          <w:bCs/>
+          <w:sz w:val="32"/>
+          <w:szCs w:val="32"/>
+          <w:u w:val="single"/>
+        </w:rPr>
+      </w:pPr>
       <w:r>
         <w:rPr>
           <w:b/>
@@ -65,7 +754,61 @@
           <w:szCs w:val="32"/>
           <w:u w:val="single"/>
         </w:rPr>
-        <w:t xml:space="preserve"> – TS </w:t>
+        <w:t>================</w:t>
+      </w:r>
+    </w:p>
+    <w:p>
+      <w:pPr>
+        <w:jc w:val="center"/>
+        <w:rPr>
+          <w:b/>
+          <w:bCs/>
+          <w:sz w:val="32"/>
+          <w:szCs w:val="32"/>
+          <w:u w:val="single"/>
+        </w:rPr>
+      </w:pPr>
+    </w:p>
+    <w:p>
+      <w:pPr>
+        <w:jc w:val="center"/>
+        <w:rPr>
+          <w:b/>
+          <w:bCs/>
+          <w:sz w:val="32"/>
+          <w:szCs w:val="32"/>
+          <w:u w:val="single"/>
+        </w:rPr>
+      </w:pPr>
+      <w:r>
+        <w:rPr>
+          <w:b/>
+          <w:bCs/>
+          <w:sz w:val="32"/>
+          <w:szCs w:val="32"/>
+          <w:u w:val="single"/>
+        </w:rPr>
+        <w:t xml:space="preserve">TS </w:t>
+      </w:r>
+      <w:r>
+        <w:rPr>
+          <w:b/>
+          <w:bCs/>
+          <w:sz w:val="32"/>
+          <w:szCs w:val="32"/>
+          <w:u w:val="single"/>
+        </w:rPr>
+        <w:t>Krama</w:t>
+      </w:r>
+      <w:r>
+        <w:rPr>
+          <w:b/>
+          <w:bCs/>
+          <w:sz w:val="32"/>
+          <w:szCs w:val="32"/>
+          <w:u w:val="single"/>
+        </w:rPr>
+        <w:t xml:space="preserve"> Paatam – TS </w:t>
       </w:r>
       <w:r>
         <w:rPr>
@@ -306,19 +1049,8 @@
                 <w:sz w:val="28"/>
                 <w:szCs w:val="32"/>
               </w:rPr>
-              <w:t xml:space="preserve">.3 – </w:t>
-            </w:r>
-            <w:proofErr w:type="spellStart"/>
-            <w:r>
-              <w:rPr>
-                <w:rFonts w:cs="Arial"/>
-                <w:b/>
-                <w:sz w:val="28"/>
-                <w:szCs w:val="32"/>
-              </w:rPr>
-              <w:t>Kramam</w:t>
-            </w:r>
-            <w:proofErr w:type="spellEnd"/>
+              <w:t>.3 – Kramam</w:t>
+            </w:r>
           </w:p>
           <w:p>
             <w:pPr>
@@ -338,45 +1070,14 @@
                 <w:szCs w:val="32"/>
               </w:rPr>
             </w:pPr>
-            <w:proofErr w:type="spellStart"/>
-            <w:r>
-              <w:rPr>
-                <w:rFonts w:cs="Arial"/>
-                <w:b/>
-                <w:sz w:val="28"/>
-                <w:szCs w:val="32"/>
-              </w:rPr>
-              <w:t>Krama</w:t>
-            </w:r>
-            <w:proofErr w:type="spellEnd"/>
-            <w:r>
-              <w:rPr>
-                <w:rFonts w:cs="Arial"/>
-                <w:b/>
-                <w:sz w:val="28"/>
-                <w:szCs w:val="32"/>
-              </w:rPr>
-              <w:t xml:space="preserve"> </w:t>
-            </w:r>
-            <w:proofErr w:type="spellStart"/>
-            <w:r>
-              <w:rPr>
-                <w:rFonts w:cs="Arial"/>
-                <w:b/>
-                <w:sz w:val="28"/>
-                <w:szCs w:val="32"/>
-              </w:rPr>
-              <w:t>Vaakyam</w:t>
-            </w:r>
-            <w:proofErr w:type="spellEnd"/>
-            <w:r>
-              <w:rPr>
-                <w:rFonts w:cs="Arial"/>
-                <w:b/>
-                <w:sz w:val="28"/>
-                <w:szCs w:val="32"/>
-              </w:rPr>
-              <w:t xml:space="preserve"> No.– </w:t>
+            <w:r>
+              <w:rPr>
+                <w:rFonts w:cs="Arial"/>
+                <w:b/>
+                <w:sz w:val="28"/>
+                <w:szCs w:val="32"/>
+              </w:rPr>
+              <w:t xml:space="preserve">Krama Vaakyam No.– </w:t>
             </w:r>
             <w:r>
               <w:rPr>
@@ -406,25 +1107,14 @@
                 <w:szCs w:val="32"/>
               </w:rPr>
             </w:pPr>
-            <w:proofErr w:type="spellStart"/>
-            <w:r>
-              <w:rPr>
-                <w:rFonts w:cs="Arial"/>
-                <w:b/>
-                <w:sz w:val="28"/>
-                <w:szCs w:val="32"/>
-              </w:rPr>
-              <w:t>Panchaati</w:t>
-            </w:r>
-            <w:proofErr w:type="spellEnd"/>
-            <w:r>
-              <w:rPr>
-                <w:rFonts w:cs="Arial"/>
-                <w:b/>
-                <w:sz w:val="28"/>
-                <w:szCs w:val="32"/>
-              </w:rPr>
-              <w:t xml:space="preserve"> No</w:t>
+            <w:r>
+              <w:rPr>
+                <w:rFonts w:cs="Arial"/>
+                <w:b/>
+                <w:sz w:val="28"/>
+                <w:szCs w:val="32"/>
+              </w:rPr>
+              <w:t>Panchaati No</w:t>
             </w:r>
             <w:r>
               <w:rPr>
@@ -803,6 +1493,21 @@
         </w:tc>
       </w:tr>
     </w:tbl>
+    <w:p>
+      <w:pPr>
+        <w:pBdr>
+          <w:bottom w:val="double" w:sz="6" w:space="1" w:color="auto"/>
+        </w:pBdr>
+        <w:jc w:val="center"/>
+        <w:rPr>
+          <w:b/>
+          <w:bCs/>
+          <w:sz w:val="32"/>
+          <w:szCs w:val="32"/>
+          <w:u w:val="single"/>
+        </w:rPr>
+      </w:pPr>
+    </w:p>
     <w:p>
       <w:pPr>
         <w:jc w:val="center"/>
@@ -814,16 +1519,6 @@
           <w:u w:val="single"/>
         </w:rPr>
       </w:pPr>
-      <w:r>
-        <w:rPr>
-          <w:b/>
-          <w:bCs/>
-          <w:sz w:val="32"/>
-          <w:szCs w:val="32"/>
-          <w:u w:val="single"/>
-        </w:rPr>
-        <w:t>================</w:t>
-      </w:r>
     </w:p>
     <w:p>
       <w:pPr>
@@ -844,9 +1539,9 @@
           <w:szCs w:val="32"/>
           <w:u w:val="single"/>
         </w:rPr>
+        <w:lastRenderedPageBreak/>
         <w:t xml:space="preserve">TS </w:t>
       </w:r>
-      <w:proofErr w:type="spellStart"/>
       <w:r>
         <w:rPr>
           <w:b/>
@@ -857,7 +1552,6 @@
         </w:rPr>
         <w:t>Krama</w:t>
       </w:r>
-      <w:proofErr w:type="spellEnd"/>
       <w:r>
         <w:rPr>
           <w:b/>
@@ -866,29 +1560,7 @@
           <w:szCs w:val="32"/>
           <w:u w:val="single"/>
         </w:rPr>
-        <w:t xml:space="preserve"> </w:t>
-      </w:r>
-      <w:proofErr w:type="spellStart"/>
-      <w:r>
-        <w:rPr>
-          <w:b/>
-          <w:bCs/>
-          <w:sz w:val="32"/>
-          <w:szCs w:val="32"/>
-          <w:u w:val="single"/>
-        </w:rPr>
-        <w:t>Paatam</w:t>
-      </w:r>
-      <w:proofErr w:type="spellEnd"/>
-      <w:r>
-        <w:rPr>
-          <w:b/>
-          <w:bCs/>
-          <w:sz w:val="32"/>
-          <w:szCs w:val="32"/>
-          <w:u w:val="single"/>
-        </w:rPr>
-        <w:t xml:space="preserve"> – TS </w:t>
+        <w:t xml:space="preserve"> Paatam – TS </w:t>
       </w:r>
       <w:r>
         <w:rPr>
@@ -1290,25 +1962,7 @@
                 <w:sz w:val="40"/>
                 <w:szCs w:val="40"/>
               </w:rPr>
-              <w:t xml:space="preserve"> </w:t>
-            </w:r>
-            <w:proofErr w:type="spellStart"/>
-            <w:r>
-              <w:rPr>
-                <w:rFonts w:ascii="BRH Devanagari Extra" w:hAnsi="BRH Devanagari Extra" w:cs="BRH Devanagari Extra"/>
-                <w:sz w:val="40"/>
-                <w:szCs w:val="40"/>
-              </w:rPr>
-              <w:t>oÉ</w:t>
-            </w:r>
-            <w:proofErr w:type="spellEnd"/>
-            <w:r>
-              <w:rPr>
-                <w:rFonts w:ascii="BRH Devanagari Extra" w:hAnsi="BRH Devanagari Extra" w:cs="BRH Devanagari Extra"/>
-                <w:sz w:val="40"/>
-                <w:szCs w:val="40"/>
-              </w:rPr>
-              <w:t>×</w:t>
+              <w:t xml:space="preserve"> oÉ×</w:t>
             </w:r>
             <w:r>
               <w:rPr>
@@ -1427,25 +2081,7 @@
                 <w:sz w:val="40"/>
                 <w:szCs w:val="40"/>
               </w:rPr>
-              <w:t xml:space="preserve"> </w:t>
-            </w:r>
-            <w:proofErr w:type="spellStart"/>
-            <w:r>
-              <w:rPr>
-                <w:rFonts w:ascii="BRH Devanagari Extra" w:hAnsi="BRH Devanagari Extra" w:cs="BRH Devanagari Extra"/>
-                <w:sz w:val="40"/>
-                <w:szCs w:val="40"/>
-              </w:rPr>
-              <w:t>oÉ</w:t>
-            </w:r>
-            <w:proofErr w:type="spellEnd"/>
-            <w:r>
-              <w:rPr>
-                <w:rFonts w:ascii="BRH Devanagari Extra" w:hAnsi="BRH Devanagari Extra" w:cs="BRH Devanagari Extra"/>
-                <w:sz w:val="40"/>
-                <w:szCs w:val="40"/>
-              </w:rPr>
-              <w:t>×</w:t>
+              <w:t xml:space="preserve"> oÉ×</w:t>
             </w:r>
             <w:r>
               <w:rPr>
@@ -1919,19 +2555,8 @@
                 <w:sz w:val="28"/>
                 <w:szCs w:val="32"/>
               </w:rPr>
-              <w:t xml:space="preserve">T.S.6.5.4.1 – </w:t>
-            </w:r>
-            <w:proofErr w:type="spellStart"/>
-            <w:r>
-              <w:rPr>
-                <w:rFonts w:cs="Arial"/>
-                <w:b/>
-                <w:sz w:val="28"/>
-                <w:szCs w:val="32"/>
-              </w:rPr>
-              <w:t>Kramam</w:t>
-            </w:r>
-            <w:proofErr w:type="spellEnd"/>
+              <w:t>T.S.6.5.4.1 – Kramam</w:t>
+            </w:r>
           </w:p>
           <w:p>
             <w:pPr>
@@ -1951,45 +2576,14 @@
                 <w:szCs w:val="32"/>
               </w:rPr>
             </w:pPr>
-            <w:proofErr w:type="spellStart"/>
-            <w:r>
-              <w:rPr>
-                <w:rFonts w:cs="Arial"/>
-                <w:b/>
-                <w:sz w:val="28"/>
-                <w:szCs w:val="32"/>
-              </w:rPr>
-              <w:t>Krama</w:t>
-            </w:r>
-            <w:proofErr w:type="spellEnd"/>
-            <w:r>
-              <w:rPr>
-                <w:rFonts w:cs="Arial"/>
-                <w:b/>
-                <w:sz w:val="28"/>
-                <w:szCs w:val="32"/>
-              </w:rPr>
-              <w:t xml:space="preserve"> </w:t>
-            </w:r>
-            <w:proofErr w:type="spellStart"/>
-            <w:r>
-              <w:rPr>
-                <w:rFonts w:cs="Arial"/>
-                <w:b/>
-                <w:sz w:val="28"/>
-                <w:szCs w:val="32"/>
-              </w:rPr>
-              <w:t>Vaakyam</w:t>
-            </w:r>
-            <w:proofErr w:type="spellEnd"/>
-            <w:r>
-              <w:rPr>
-                <w:rFonts w:cs="Arial"/>
-                <w:b/>
-                <w:sz w:val="28"/>
-                <w:szCs w:val="32"/>
-              </w:rPr>
-              <w:t xml:space="preserve"> No.– 38</w:t>
+            <w:r>
+              <w:rPr>
+                <w:rFonts w:cs="Arial"/>
+                <w:b/>
+                <w:sz w:val="28"/>
+                <w:szCs w:val="32"/>
+              </w:rPr>
+              <w:t>Krama Vaakyam No.– 38</w:t>
             </w:r>
           </w:p>
           <w:p>
@@ -2010,25 +2604,14 @@
                 <w:szCs w:val="32"/>
               </w:rPr>
             </w:pPr>
-            <w:proofErr w:type="spellStart"/>
-            <w:r>
-              <w:rPr>
-                <w:rFonts w:cs="Arial"/>
-                <w:b/>
-                <w:sz w:val="28"/>
-                <w:szCs w:val="32"/>
-              </w:rPr>
-              <w:t>Panchaati</w:t>
-            </w:r>
-            <w:proofErr w:type="spellEnd"/>
-            <w:r>
-              <w:rPr>
-                <w:rFonts w:cs="Arial"/>
-                <w:b/>
-                <w:sz w:val="28"/>
-                <w:szCs w:val="32"/>
-              </w:rPr>
-              <w:t xml:space="preserve"> No</w:t>
+            <w:r>
+              <w:rPr>
+                <w:rFonts w:cs="Arial"/>
+                <w:b/>
+                <w:sz w:val="28"/>
+                <w:szCs w:val="32"/>
+              </w:rPr>
+              <w:t>Panchaati No</w:t>
             </w:r>
             <w:r>
               <w:rPr>
@@ -2064,7 +2647,6 @@
                 <w:lang w:val="en-IN" w:eastAsia="en-IN" w:bidi="ml-IN"/>
               </w:rPr>
             </w:pPr>
-            <w:proofErr w:type="spellStart"/>
             <w:r>
               <w:rPr>
                 <w:rFonts w:ascii="BRH Devanagari Extra" w:hAnsi="BRH Devanagari Extra" w:cs="BRH Devanagari Extra"/>
@@ -2073,7 +2655,6 @@
               </w:rPr>
               <w:t>Lå</w:t>
             </w:r>
-            <w:proofErr w:type="spellEnd"/>
             <w:r>
               <w:rPr>
                 <w:rFonts w:ascii="BRH Malayalam Extra" w:hAnsi="BRH Malayalam Extra" w:cs="BRH Devanagari Extra"/>
@@ -2126,25 +2707,7 @@
                 <w:sz w:val="40"/>
                 <w:szCs w:val="40"/>
               </w:rPr>
-              <w:t xml:space="preserve"> </w:t>
-            </w:r>
-            <w:proofErr w:type="spellStart"/>
-            <w:r>
-              <w:rPr>
-                <w:rFonts w:ascii="BRH Devanagari Extra" w:hAnsi="BRH Devanagari Extra" w:cs="BRH Devanagari Extra"/>
-                <w:sz w:val="40"/>
-                <w:szCs w:val="40"/>
-              </w:rPr>
-              <w:t>aÉ</w:t>
-            </w:r>
-            <w:proofErr w:type="spellEnd"/>
-            <w:r>
-              <w:rPr>
-                <w:rFonts w:ascii="BRH Devanagari Extra" w:hAnsi="BRH Devanagari Extra" w:cs="BRH Devanagari Extra"/>
-                <w:sz w:val="40"/>
-                <w:szCs w:val="40"/>
-              </w:rPr>
-              <w:t>×</w:t>
+              <w:t xml:space="preserve"> aÉ×</w:t>
             </w:r>
             <w:r>
               <w:rPr>
@@ -2215,7 +2778,6 @@
                 <w:lang w:val="en-IN" w:eastAsia="en-IN" w:bidi="ml-IN"/>
               </w:rPr>
             </w:pPr>
-            <w:proofErr w:type="spellStart"/>
             <w:r>
               <w:rPr>
                 <w:rFonts w:ascii="BRH Devanagari Extra" w:hAnsi="BRH Devanagari Extra" w:cs="BRH Devanagari Extra"/>
@@ -2224,7 +2786,6 @@
               </w:rPr>
               <w:t>Lå</w:t>
             </w:r>
-            <w:proofErr w:type="spellEnd"/>
             <w:r>
               <w:rPr>
                 <w:rFonts w:ascii="BRH Malayalam Extra" w:hAnsi="BRH Malayalam Extra" w:cs="BRH Devanagari Extra"/>
@@ -2277,25 +2838,7 @@
                 <w:sz w:val="40"/>
                 <w:szCs w:val="40"/>
               </w:rPr>
-              <w:t xml:space="preserve"> </w:t>
-            </w:r>
-            <w:proofErr w:type="spellStart"/>
-            <w:r>
-              <w:rPr>
-                <w:rFonts w:ascii="BRH Devanagari Extra" w:hAnsi="BRH Devanagari Extra" w:cs="BRH Devanagari Extra"/>
-                <w:sz w:val="40"/>
-                <w:szCs w:val="40"/>
-              </w:rPr>
-              <w:t>aÉ</w:t>
-            </w:r>
-            <w:proofErr w:type="spellEnd"/>
-            <w:r>
-              <w:rPr>
-                <w:rFonts w:ascii="BRH Devanagari Extra" w:hAnsi="BRH Devanagari Extra" w:cs="BRH Devanagari Extra"/>
-                <w:sz w:val="40"/>
-                <w:szCs w:val="40"/>
-              </w:rPr>
-              <w:t>×</w:t>
+              <w:t xml:space="preserve"> aÉ×</w:t>
             </w:r>
             <w:r>
               <w:rPr>
@@ -2385,20 +2928,8 @@
                 <w:sz w:val="28"/>
                 <w:szCs w:val="32"/>
               </w:rPr>
-              <w:lastRenderedPageBreak/>
-              <w:t xml:space="preserve">T.S.6.5.4.2 – </w:t>
-            </w:r>
-            <w:proofErr w:type="spellStart"/>
-            <w:r>
-              <w:rPr>
-                <w:rFonts w:cs="Arial"/>
-                <w:b/>
-                <w:sz w:val="28"/>
-                <w:szCs w:val="32"/>
-              </w:rPr>
-              <w:t>Kramam</w:t>
-            </w:r>
-            <w:proofErr w:type="spellEnd"/>
+              <w:t>T.S.6.5.4.2 – Kramam</w:t>
+            </w:r>
           </w:p>
           <w:p>
             <w:pPr>
@@ -2418,45 +2949,14 @@
                 <w:szCs w:val="32"/>
               </w:rPr>
             </w:pPr>
-            <w:proofErr w:type="spellStart"/>
-            <w:r>
-              <w:rPr>
-                <w:rFonts w:cs="Arial"/>
-                <w:b/>
-                <w:sz w:val="28"/>
-                <w:szCs w:val="32"/>
-              </w:rPr>
-              <w:t>Krama</w:t>
-            </w:r>
-            <w:proofErr w:type="spellEnd"/>
-            <w:r>
-              <w:rPr>
-                <w:rFonts w:cs="Arial"/>
-                <w:b/>
-                <w:sz w:val="28"/>
-                <w:szCs w:val="32"/>
-              </w:rPr>
-              <w:t xml:space="preserve"> </w:t>
-            </w:r>
-            <w:proofErr w:type="spellStart"/>
-            <w:r>
-              <w:rPr>
-                <w:rFonts w:cs="Arial"/>
-                <w:b/>
-                <w:sz w:val="28"/>
-                <w:szCs w:val="32"/>
-              </w:rPr>
-              <w:t>Vaakyam</w:t>
-            </w:r>
-            <w:proofErr w:type="spellEnd"/>
-            <w:r>
-              <w:rPr>
-                <w:rFonts w:cs="Arial"/>
-                <w:b/>
-                <w:sz w:val="28"/>
-                <w:szCs w:val="32"/>
-              </w:rPr>
-              <w:t xml:space="preserve"> No.– 2</w:t>
+            <w:r>
+              <w:rPr>
+                <w:rFonts w:cs="Arial"/>
+                <w:b/>
+                <w:sz w:val="28"/>
+                <w:szCs w:val="32"/>
+              </w:rPr>
+              <w:t>Krama Vaakyam No.– 2</w:t>
             </w:r>
           </w:p>
           <w:p>
@@ -2477,25 +2977,14 @@
                 <w:szCs w:val="32"/>
               </w:rPr>
             </w:pPr>
-            <w:proofErr w:type="spellStart"/>
-            <w:r>
-              <w:rPr>
-                <w:rFonts w:cs="Arial"/>
-                <w:b/>
-                <w:sz w:val="28"/>
-                <w:szCs w:val="32"/>
-              </w:rPr>
-              <w:t>Panchaati</w:t>
-            </w:r>
-            <w:proofErr w:type="spellEnd"/>
-            <w:r>
-              <w:rPr>
-                <w:rFonts w:cs="Arial"/>
-                <w:b/>
-                <w:sz w:val="28"/>
-                <w:szCs w:val="32"/>
-              </w:rPr>
-              <w:t xml:space="preserve"> No</w:t>
+            <w:r>
+              <w:rPr>
+                <w:rFonts w:cs="Arial"/>
+                <w:b/>
+                <w:sz w:val="28"/>
+                <w:szCs w:val="32"/>
+              </w:rPr>
+              <w:t>Panchaati No</w:t>
             </w:r>
             <w:r>
               <w:rPr>
@@ -2605,7 +3094,6 @@
               </w:rPr>
               <w:t>–</w:t>
             </w:r>
-            <w:proofErr w:type="spellStart"/>
             <w:r>
               <w:rPr>
                 <w:rFonts w:ascii="BRH Devanagari Extra" w:hAnsi="BRH Devanagari Extra" w:cs="BRH Devanagari Extra"/>
@@ -2615,7 +3103,6 @@
               </w:rPr>
               <w:t>eÉÉ</w:t>
             </w:r>
-            <w:proofErr w:type="spellEnd"/>
             <w:r>
               <w:rPr>
                 <w:rFonts w:ascii="BRH Devanagari Extra" w:hAnsi="BRH Devanagari Extra" w:cs="BRH Devanagari Extra"/>
@@ -2844,19 +3331,8 @@
                 <w:sz w:val="28"/>
                 <w:szCs w:val="32"/>
               </w:rPr>
-              <w:t xml:space="preserve">T.S.6.5.6.5 – </w:t>
-            </w:r>
-            <w:proofErr w:type="spellStart"/>
-            <w:r>
-              <w:rPr>
-                <w:rFonts w:cs="Arial"/>
-                <w:b/>
-                <w:sz w:val="28"/>
-                <w:szCs w:val="32"/>
-              </w:rPr>
-              <w:t>Kramam</w:t>
-            </w:r>
-            <w:proofErr w:type="spellEnd"/>
+              <w:t>T.S.6.5.6.5 – Kramam</w:t>
+            </w:r>
           </w:p>
           <w:p>
             <w:pPr>
@@ -3251,19 +3727,8 @@
                 <w:sz w:val="28"/>
                 <w:szCs w:val="32"/>
               </w:rPr>
-              <w:t xml:space="preserve">T.S.6.5.7.1 – </w:t>
-            </w:r>
-            <w:proofErr w:type="spellStart"/>
-            <w:r>
-              <w:rPr>
-                <w:rFonts w:cs="Arial"/>
-                <w:b/>
-                <w:sz w:val="28"/>
-                <w:szCs w:val="32"/>
-              </w:rPr>
-              <w:t>Kramam</w:t>
-            </w:r>
-            <w:proofErr w:type="spellEnd"/>
+              <w:t>T.S.6.5.7.1 – Kramam</w:t>
+            </w:r>
           </w:p>
           <w:p>
             <w:pPr>
@@ -3283,45 +3748,14 @@
                 <w:szCs w:val="32"/>
               </w:rPr>
             </w:pPr>
-            <w:proofErr w:type="spellStart"/>
-            <w:r>
-              <w:rPr>
-                <w:rFonts w:cs="Arial"/>
-                <w:b/>
-                <w:sz w:val="28"/>
-                <w:szCs w:val="32"/>
-              </w:rPr>
-              <w:t>Krama</w:t>
-            </w:r>
-            <w:proofErr w:type="spellEnd"/>
-            <w:r>
-              <w:rPr>
-                <w:rFonts w:cs="Arial"/>
-                <w:b/>
-                <w:sz w:val="28"/>
-                <w:szCs w:val="32"/>
-              </w:rPr>
-              <w:t xml:space="preserve"> </w:t>
-            </w:r>
-            <w:proofErr w:type="spellStart"/>
-            <w:r>
-              <w:rPr>
-                <w:rFonts w:cs="Arial"/>
-                <w:b/>
-                <w:sz w:val="28"/>
-                <w:szCs w:val="32"/>
-              </w:rPr>
-              <w:t>Vaakyam</w:t>
-            </w:r>
-            <w:proofErr w:type="spellEnd"/>
-            <w:r>
-              <w:rPr>
-                <w:rFonts w:cs="Arial"/>
-                <w:b/>
-                <w:sz w:val="28"/>
-                <w:szCs w:val="32"/>
-              </w:rPr>
-              <w:t xml:space="preserve"> No.– 4</w:t>
+            <w:r>
+              <w:rPr>
+                <w:rFonts w:cs="Arial"/>
+                <w:b/>
+                <w:sz w:val="28"/>
+                <w:szCs w:val="32"/>
+              </w:rPr>
+              <w:t>Krama Vaakyam No.– 4</w:t>
             </w:r>
           </w:p>
           <w:p>
@@ -3342,25 +3776,14 @@
                 <w:szCs w:val="32"/>
               </w:rPr>
             </w:pPr>
-            <w:proofErr w:type="spellStart"/>
-            <w:r>
-              <w:rPr>
-                <w:rFonts w:cs="Arial"/>
-                <w:b/>
-                <w:sz w:val="28"/>
-                <w:szCs w:val="32"/>
-              </w:rPr>
-              <w:t>Panchaati</w:t>
-            </w:r>
-            <w:proofErr w:type="spellEnd"/>
-            <w:r>
-              <w:rPr>
-                <w:rFonts w:cs="Arial"/>
-                <w:b/>
-                <w:sz w:val="28"/>
-                <w:szCs w:val="32"/>
-              </w:rPr>
-              <w:t xml:space="preserve"> No</w:t>
+            <w:r>
+              <w:rPr>
+                <w:rFonts w:cs="Arial"/>
+                <w:b/>
+                <w:sz w:val="28"/>
+                <w:szCs w:val="32"/>
+              </w:rPr>
+              <w:t>Panchaati No</w:t>
             </w:r>
             <w:r>
               <w:rPr>
@@ -3506,7 +3929,6 @@
               </w:rPr>
               <w:t>–</w:t>
             </w:r>
-            <w:proofErr w:type="spellStart"/>
             <w:r>
               <w:rPr>
                 <w:rFonts w:ascii="BRH Devanagari Extra" w:hAnsi="BRH Devanagari Extra" w:cs="BRH Devanagari Extra"/>
@@ -3515,7 +3937,6 @@
               </w:rPr>
               <w:t>aÉë</w:t>
             </w:r>
-            <w:proofErr w:type="spellEnd"/>
             <w:r>
               <w:rPr>
                 <w:rFonts w:ascii="BRH Malayalam Extra" w:hAnsi="BRH Malayalam Extra" w:cs="BRH Devanagari Extra"/>
@@ -3707,7 +4128,6 @@
               </w:rPr>
               <w:t>–</w:t>
             </w:r>
-            <w:proofErr w:type="spellStart"/>
             <w:r>
               <w:rPr>
                 <w:rFonts w:ascii="BRH Devanagari Extra" w:hAnsi="BRH Devanagari Extra" w:cs="BRH Devanagari Extra"/>
@@ -3716,17 +4136,15 @@
               </w:rPr>
               <w:t>aÉë</w:t>
             </w:r>
-            <w:proofErr w:type="spellEnd"/>
-            <w:r>
-              <w:rPr>
-                <w:rFonts w:ascii="BRH Malayalam Extra" w:hAnsi="BRH Malayalam Extra" w:cs="BRH Devanagari Extra"/>
-                <w:b/>
-                <w:sz w:val="32"/>
-                <w:szCs w:val="40"/>
-              </w:rPr>
-              <w:t>–</w:t>
-            </w:r>
-            <w:proofErr w:type="spellStart"/>
+            <w:r>
+              <w:rPr>
+                <w:rFonts w:ascii="BRH Malayalam Extra" w:hAnsi="BRH Malayalam Extra" w:cs="BRH Devanagari Extra"/>
+                <w:b/>
+                <w:sz w:val="32"/>
+                <w:szCs w:val="40"/>
+              </w:rPr>
+              <w:t>–</w:t>
+            </w:r>
             <w:r>
               <w:rPr>
                 <w:rFonts w:ascii="BRH Devanagari Extra" w:hAnsi="BRH Devanagari Extra" w:cs="BRH Devanagari Extra"/>
@@ -3736,7 +4154,6 @@
               </w:rPr>
               <w:t>rÉ</w:t>
             </w:r>
-            <w:proofErr w:type="spellEnd"/>
             <w:r>
               <w:rPr>
                 <w:rFonts w:ascii="BRH Malayalam Extra" w:hAnsi="BRH Malayalam Extra" w:cs="BRH Devanagari Extra"/>
@@ -3819,19 +4236,9 @@
                 <w:sz w:val="28"/>
                 <w:szCs w:val="32"/>
               </w:rPr>
-              <w:t xml:space="preserve">T.S.6.5.7.2 – </w:t>
-            </w:r>
-            <w:proofErr w:type="spellStart"/>
-            <w:r>
-              <w:rPr>
-                <w:rFonts w:cs="Arial"/>
-                <w:b/>
-                <w:sz w:val="28"/>
-                <w:szCs w:val="32"/>
-              </w:rPr>
-              <w:t>Kramam</w:t>
-            </w:r>
-            <w:proofErr w:type="spellEnd"/>
+              <w:lastRenderedPageBreak/>
+              <w:t>T.S.6.5.7.2 – Kramam</w:t>
+            </w:r>
           </w:p>
           <w:p>
             <w:pPr>
@@ -4320,7 +4727,6 @@
                 <w:szCs w:val="40"/>
               </w:rPr>
             </w:pPr>
-            <w:proofErr w:type="spellStart"/>
             <w:r>
               <w:rPr>
                 <w:rFonts w:ascii="BRH Devanagari Extra" w:hAnsi="BRH Devanagari Extra" w:cs="BRH Devanagari Extra"/>
@@ -4329,7 +4735,6 @@
               </w:rPr>
               <w:t>xÉ</w:t>
             </w:r>
-            <w:proofErr w:type="spellEnd"/>
             <w:r>
               <w:rPr>
                 <w:rFonts w:ascii="BRH Malayalam Extra" w:hAnsi="BRH Malayalam Extra" w:cs="BRH Devanagari Extra"/>
@@ -4358,7 +4763,6 @@
               </w:rPr>
               <w:t>–</w:t>
             </w:r>
-            <w:proofErr w:type="spellStart"/>
             <w:r>
               <w:rPr>
                 <w:rFonts w:ascii="BRH Devanagari Extra" w:hAnsi="BRH Devanagari Extra" w:cs="BRH Devanagari Extra"/>
@@ -4367,7 +4771,6 @@
               </w:rPr>
               <w:t>iÉ</w:t>
             </w:r>
-            <w:proofErr w:type="spellEnd"/>
             <w:r>
               <w:rPr>
                 <w:rFonts w:ascii="BRH Devanagari Extra" w:hAnsi="BRH Devanagari Extra" w:cs="BRH Devanagari Extra"/>
@@ -4510,7 +4913,6 @@
                 <w:lang w:val="en-IN" w:eastAsia="en-IN" w:bidi="ml-IN"/>
               </w:rPr>
             </w:pPr>
-            <w:proofErr w:type="spellStart"/>
             <w:r>
               <w:rPr>
                 <w:rFonts w:ascii="BRH Devanagari Extra" w:hAnsi="BRH Devanagari Extra" w:cs="BRH Devanagari Extra"/>
@@ -4519,7 +4921,6 @@
               </w:rPr>
               <w:t>xÉ</w:t>
             </w:r>
-            <w:proofErr w:type="spellEnd"/>
             <w:r>
               <w:rPr>
                 <w:rFonts w:ascii="BRH Malayalam Extra" w:hAnsi="BRH Malayalam Extra" w:cs="BRH Devanagari Extra"/>
@@ -4548,23 +4949,13 @@
               </w:rPr>
               <w:t>–</w:t>
             </w:r>
-            <w:proofErr w:type="spellStart"/>
-            <w:r>
-              <w:rPr>
-                <w:rFonts w:ascii="BRH Devanagari Extra" w:hAnsi="BRH Devanagari Extra" w:cs="BRH Devanagari Extra"/>
-                <w:sz w:val="40"/>
-                <w:szCs w:val="40"/>
-              </w:rPr>
-              <w:t>iÉ</w:t>
-            </w:r>
-            <w:proofErr w:type="spellEnd"/>
-            <w:r>
-              <w:rPr>
-                <w:rFonts w:ascii="BRH Devanagari Extra" w:hAnsi="BRH Devanagari Extra" w:cs="BRH Devanagari Extra"/>
-                <w:sz w:val="40"/>
-                <w:szCs w:val="40"/>
-              </w:rPr>
-              <w:t>×</w:t>
+            <w:r>
+              <w:rPr>
+                <w:rFonts w:ascii="BRH Devanagari Extra" w:hAnsi="BRH Devanagari Extra" w:cs="BRH Devanagari Extra"/>
+                <w:sz w:val="40"/>
+                <w:szCs w:val="40"/>
+              </w:rPr>
+              <w:t>iÉ×</w:t>
             </w:r>
             <w:r>
               <w:rPr>
@@ -4762,7 +5153,6 @@
                 <w:szCs w:val="40"/>
               </w:rPr>
             </w:pPr>
-            <w:proofErr w:type="spellStart"/>
             <w:r>
               <w:rPr>
                 <w:rFonts w:ascii="BRH Devanagari Extra" w:hAnsi="BRH Devanagari Extra" w:cs="BRH Devanagari Extra"/>
@@ -4771,7 +5161,6 @@
               </w:rPr>
               <w:t>xÉ</w:t>
             </w:r>
-            <w:proofErr w:type="spellEnd"/>
             <w:r>
               <w:rPr>
                 <w:rFonts w:ascii="BRH Malayalam Extra" w:hAnsi="BRH Malayalam Extra" w:cs="BRH Devanagari Extra"/>
@@ -4800,23 +5189,13 @@
               </w:rPr>
               <w:t>–</w:t>
             </w:r>
-            <w:proofErr w:type="spellStart"/>
-            <w:r>
-              <w:rPr>
-                <w:rFonts w:ascii="BRH Devanagari Extra" w:hAnsi="BRH Devanagari Extra" w:cs="BRH Devanagari Extra"/>
-                <w:sz w:val="40"/>
-                <w:szCs w:val="40"/>
-              </w:rPr>
-              <w:t>iÉ</w:t>
-            </w:r>
-            <w:proofErr w:type="spellEnd"/>
-            <w:r>
-              <w:rPr>
-                <w:rFonts w:ascii="BRH Devanagari Extra" w:hAnsi="BRH Devanagari Extra" w:cs="BRH Devanagari Extra"/>
-                <w:sz w:val="40"/>
-                <w:szCs w:val="40"/>
-              </w:rPr>
-              <w:t>×</w:t>
+            <w:r>
+              <w:rPr>
+                <w:rFonts w:ascii="BRH Devanagari Extra" w:hAnsi="BRH Devanagari Extra" w:cs="BRH Devanagari Extra"/>
+                <w:sz w:val="40"/>
+                <w:szCs w:val="40"/>
+              </w:rPr>
+              <w:t>iÉ×</w:t>
             </w:r>
             <w:r>
               <w:rPr>
@@ -4954,7 +5333,6 @@
                 <w:lang w:val="en-IN" w:eastAsia="en-IN" w:bidi="ml-IN"/>
               </w:rPr>
             </w:pPr>
-            <w:proofErr w:type="spellStart"/>
             <w:r>
               <w:rPr>
                 <w:rFonts w:ascii="BRH Devanagari Extra" w:hAnsi="BRH Devanagari Extra" w:cs="BRH Devanagari Extra"/>
@@ -4963,7 +5341,6 @@
               </w:rPr>
               <w:t>xÉ</w:t>
             </w:r>
-            <w:proofErr w:type="spellEnd"/>
             <w:r>
               <w:rPr>
                 <w:rFonts w:ascii="BRH Malayalam Extra" w:hAnsi="BRH Malayalam Extra" w:cs="BRH Devanagari Extra"/>
@@ -4992,34 +5369,23 @@
               </w:rPr>
               <w:t>–</w:t>
             </w:r>
-            <w:proofErr w:type="spellStart"/>
-            <w:r>
-              <w:rPr>
-                <w:rFonts w:ascii="BRH Devanagari Extra" w:hAnsi="BRH Devanagari Extra" w:cs="BRH Devanagari Extra"/>
-                <w:sz w:val="40"/>
-                <w:szCs w:val="40"/>
-              </w:rPr>
-              <w:t>iÉ</w:t>
-            </w:r>
-            <w:proofErr w:type="spellEnd"/>
-            <w:r>
-              <w:rPr>
-                <w:rFonts w:ascii="BRH Devanagari Extra" w:hAnsi="BRH Devanagari Extra" w:cs="BRH Devanagari Extra"/>
-                <w:sz w:val="40"/>
-                <w:szCs w:val="40"/>
-              </w:rPr>
-              <w:t>×</w:t>
-            </w:r>
-            <w:r>
-              <w:rPr>
-                <w:rFonts w:ascii="BRH Malayalam Extra" w:hAnsi="BRH Malayalam Extra" w:cs="BRH Devanagari Extra"/>
-                <w:b/>
-                <w:sz w:val="32"/>
-                <w:szCs w:val="40"/>
-              </w:rPr>
-              <w:t>–</w:t>
-            </w:r>
-            <w:proofErr w:type="spellStart"/>
+            <w:r>
+              <w:rPr>
+                <w:rFonts w:ascii="BRH Devanagari Extra" w:hAnsi="BRH Devanagari Extra" w:cs="BRH Devanagari Extra"/>
+                <w:sz w:val="40"/>
+                <w:szCs w:val="40"/>
+              </w:rPr>
+              <w:t>iÉ×</w:t>
+            </w:r>
+            <w:r>
+              <w:rPr>
+                <w:rFonts w:ascii="BRH Malayalam Extra" w:hAnsi="BRH Malayalam Extra" w:cs="BRH Devanagari Extra"/>
+                <w:b/>
+                <w:sz w:val="32"/>
+                <w:szCs w:val="40"/>
+              </w:rPr>
+              <w:t>–</w:t>
+            </w:r>
             <w:r>
               <w:rPr>
                 <w:rFonts w:ascii="BRH Devanagari Extra" w:hAnsi="BRH Devanagari Extra" w:cs="BRH Devanagari Extra"/>
@@ -5029,7 +5395,6 @@
               </w:rPr>
               <w:t>mÉ</w:t>
             </w:r>
-            <w:proofErr w:type="spellEnd"/>
             <w:r>
               <w:rPr>
                 <w:rFonts w:ascii="BRH Malayalam Extra" w:hAnsi="BRH Malayalam Extra" w:cs="BRH Devanagari Extra"/>
@@ -5393,7 +5758,6 @@
               </w:rPr>
               <w:t>–</w:t>
             </w:r>
-            <w:proofErr w:type="spellStart"/>
             <w:r>
               <w:rPr>
                 <w:rFonts w:ascii="BRH Devanagari Extra" w:hAnsi="BRH Devanagari Extra" w:cs="BRH Devanagari Extra"/>
@@ -5402,7 +5766,6 @@
               </w:rPr>
               <w:t>uÉ</w:t>
             </w:r>
-            <w:proofErr w:type="spellEnd"/>
             <w:r>
               <w:rPr>
                 <w:rFonts w:ascii="BRH Malayalam Extra" w:hAnsi="BRH Malayalam Extra" w:cs="BRH Devanagari Extra"/>
@@ -5527,7 +5890,6 @@
               </w:rPr>
               <w:t>–</w:t>
             </w:r>
-            <w:proofErr w:type="spellStart"/>
             <w:r>
               <w:rPr>
                 <w:rFonts w:ascii="BRH Devanagari Extra" w:hAnsi="BRH Devanagari Extra" w:cs="BRH Devanagari Extra"/>
@@ -5536,7 +5898,6 @@
               </w:rPr>
               <w:t>uÉ</w:t>
             </w:r>
-            <w:proofErr w:type="spellEnd"/>
             <w:r>
               <w:rPr>
                 <w:rFonts w:ascii="BRH Malayalam Extra" w:hAnsi="BRH Malayalam Extra" w:cs="BRH Devanagari Extra"/>
@@ -5661,7 +6022,6 @@
                 <w:sz w:val="28"/>
                 <w:szCs w:val="32"/>
               </w:rPr>
-              <w:lastRenderedPageBreak/>
               <w:t>T.S.6.5.</w:t>
             </w:r>
             <w:r>
@@ -5680,19 +6040,8 @@
                 <w:sz w:val="28"/>
                 <w:szCs w:val="32"/>
               </w:rPr>
-              <w:t xml:space="preserve"> – </w:t>
-            </w:r>
-            <w:proofErr w:type="spellStart"/>
-            <w:r>
-              <w:rPr>
-                <w:rFonts w:cs="Arial"/>
-                <w:b/>
-                <w:sz w:val="28"/>
-                <w:szCs w:val="32"/>
-              </w:rPr>
-              <w:t>Kramam</w:t>
-            </w:r>
-            <w:proofErr w:type="spellEnd"/>
+              <w:t xml:space="preserve"> – Kramam</w:t>
+            </w:r>
           </w:p>
           <w:p>
             <w:pPr>
@@ -5712,7 +6061,6 @@
                 <w:szCs w:val="32"/>
               </w:rPr>
             </w:pPr>
-            <w:proofErr w:type="spellStart"/>
             <w:r>
               <w:rPr>
                 <w:rFonts w:cs="Arial"/>
@@ -5720,37 +6068,7 @@
                 <w:sz w:val="22"/>
                 <w:szCs w:val="32"/>
               </w:rPr>
-              <w:t>Krama</w:t>
-            </w:r>
-            <w:proofErr w:type="spellEnd"/>
-            <w:r>
-              <w:rPr>
-                <w:rFonts w:cs="Arial"/>
-                <w:b/>
-                <w:sz w:val="22"/>
-                <w:szCs w:val="32"/>
-              </w:rPr>
-              <w:t xml:space="preserve"> </w:t>
-            </w:r>
-            <w:proofErr w:type="spellStart"/>
-            <w:r>
-              <w:rPr>
-                <w:rFonts w:cs="Arial"/>
-                <w:b/>
-                <w:sz w:val="22"/>
-                <w:szCs w:val="32"/>
-              </w:rPr>
-              <w:t>Vaakyam</w:t>
-            </w:r>
-            <w:proofErr w:type="spellEnd"/>
-            <w:r>
-              <w:rPr>
-                <w:rFonts w:cs="Arial"/>
-                <w:b/>
-                <w:sz w:val="22"/>
-                <w:szCs w:val="32"/>
-              </w:rPr>
-              <w:t xml:space="preserve"> No.– 44, 45 46</w:t>
+              <w:t>Krama Vaakyam No.– 44, 45 46</w:t>
             </w:r>
           </w:p>
           <w:p>
@@ -5771,25 +6089,14 @@
                 <w:szCs w:val="32"/>
               </w:rPr>
             </w:pPr>
-            <w:proofErr w:type="spellStart"/>
-            <w:r>
-              <w:rPr>
-                <w:rFonts w:cs="Arial"/>
-                <w:b/>
-                <w:sz w:val="28"/>
-                <w:szCs w:val="32"/>
-              </w:rPr>
-              <w:t>Panchaati</w:t>
-            </w:r>
-            <w:proofErr w:type="spellEnd"/>
-            <w:r>
-              <w:rPr>
-                <w:rFonts w:cs="Arial"/>
-                <w:b/>
-                <w:sz w:val="28"/>
-                <w:szCs w:val="32"/>
-              </w:rPr>
-              <w:t xml:space="preserve"> No</w:t>
+            <w:r>
+              <w:rPr>
+                <w:rFonts w:cs="Arial"/>
+                <w:b/>
+                <w:sz w:val="28"/>
+                <w:szCs w:val="32"/>
+              </w:rPr>
+              <w:t>Panchaati No</w:t>
             </w:r>
             <w:r>
               <w:rPr>
@@ -5823,7 +6130,6 @@
                 <w:szCs w:val="40"/>
               </w:rPr>
             </w:pPr>
-            <w:proofErr w:type="spellStart"/>
             <w:r>
               <w:rPr>
                 <w:rFonts w:ascii="BRH Devanagari Extra" w:hAnsi="BRH Devanagari Extra" w:cs="BRH Devanagari Extra"/>
@@ -5832,17 +6138,15 @@
               </w:rPr>
               <w:t>eÉ</w:t>
             </w:r>
-            <w:proofErr w:type="spellEnd"/>
-            <w:r>
-              <w:rPr>
-                <w:rFonts w:ascii="BRH Malayalam Extra" w:hAnsi="BRH Malayalam Extra" w:cs="BRH Devanagari Extra"/>
-                <w:b/>
-                <w:sz w:val="32"/>
-                <w:szCs w:val="40"/>
-              </w:rPr>
-              <w:t>–</w:t>
-            </w:r>
-            <w:proofErr w:type="spellStart"/>
+            <w:r>
+              <w:rPr>
+                <w:rFonts w:ascii="BRH Malayalam Extra" w:hAnsi="BRH Malayalam Extra" w:cs="BRH Devanagari Extra"/>
+                <w:b/>
+                <w:sz w:val="32"/>
+                <w:szCs w:val="40"/>
+              </w:rPr>
+              <w:t>–</w:t>
+            </w:r>
             <w:r>
               <w:rPr>
                 <w:rFonts w:ascii="BRH Devanagari Extra" w:hAnsi="BRH Devanagari Extra" w:cs="BRH Devanagari Extra"/>
@@ -5851,17 +6155,15 @@
               </w:rPr>
               <w:t>lÉ</w:t>
             </w:r>
-            <w:proofErr w:type="spellEnd"/>
-            <w:r>
-              <w:rPr>
-                <w:rFonts w:ascii="BRH Malayalam Extra" w:hAnsi="BRH Malayalam Extra" w:cs="BRH Devanagari Extra"/>
-                <w:b/>
-                <w:sz w:val="32"/>
-                <w:szCs w:val="40"/>
-              </w:rPr>
-              <w:t>–</w:t>
-            </w:r>
-            <w:proofErr w:type="spellStart"/>
+            <w:r>
+              <w:rPr>
+                <w:rFonts w:ascii="BRH Malayalam Extra" w:hAnsi="BRH Malayalam Extra" w:cs="BRH Devanagari Extra"/>
+                <w:b/>
+                <w:sz w:val="32"/>
+                <w:szCs w:val="40"/>
+              </w:rPr>
+              <w:t>–</w:t>
+            </w:r>
             <w:r>
               <w:rPr>
                 <w:rFonts w:ascii="BRH Devanagari Extra" w:hAnsi="BRH Devanagari Extra" w:cs="BRH Devanagari Extra"/>
@@ -5870,7 +6172,6 @@
               </w:rPr>
               <w:t>rÉ</w:t>
             </w:r>
-            <w:proofErr w:type="spellEnd"/>
             <w:r>
               <w:rPr>
                 <w:rFonts w:ascii="BRH Malayalam Extra" w:hAnsi="BRH Malayalam Extra" w:cs="BRH Devanagari Extra"/>
@@ -6093,7 +6394,6 @@
                 <w:szCs w:val="40"/>
               </w:rPr>
             </w:pPr>
-            <w:proofErr w:type="spellStart"/>
             <w:r>
               <w:rPr>
                 <w:rFonts w:ascii="BRH Devanagari Extra" w:hAnsi="BRH Devanagari Extra" w:cs="BRH Devanagari Extra"/>
@@ -6102,17 +6402,15 @@
               </w:rPr>
               <w:t>eÉ</w:t>
             </w:r>
-            <w:proofErr w:type="spellEnd"/>
-            <w:r>
-              <w:rPr>
-                <w:rFonts w:ascii="BRH Malayalam Extra" w:hAnsi="BRH Malayalam Extra" w:cs="BRH Devanagari Extra"/>
-                <w:b/>
-                <w:sz w:val="32"/>
-                <w:szCs w:val="40"/>
-              </w:rPr>
-              <w:t>–</w:t>
-            </w:r>
-            <w:proofErr w:type="spellStart"/>
+            <w:r>
+              <w:rPr>
+                <w:rFonts w:ascii="BRH Malayalam Extra" w:hAnsi="BRH Malayalam Extra" w:cs="BRH Devanagari Extra"/>
+                <w:b/>
+                <w:sz w:val="32"/>
+                <w:szCs w:val="40"/>
+              </w:rPr>
+              <w:t>–</w:t>
+            </w:r>
             <w:r>
               <w:rPr>
                 <w:rFonts w:ascii="BRH Devanagari Extra" w:hAnsi="BRH Devanagari Extra" w:cs="BRH Devanagari Extra"/>
@@ -6121,17 +6419,15 @@
               </w:rPr>
               <w:t>lÉ</w:t>
             </w:r>
-            <w:proofErr w:type="spellEnd"/>
-            <w:r>
-              <w:rPr>
-                <w:rFonts w:ascii="BRH Malayalam Extra" w:hAnsi="BRH Malayalam Extra" w:cs="BRH Devanagari Extra"/>
-                <w:b/>
-                <w:sz w:val="32"/>
-                <w:szCs w:val="40"/>
-              </w:rPr>
-              <w:t>–</w:t>
-            </w:r>
-            <w:proofErr w:type="spellStart"/>
+            <w:r>
+              <w:rPr>
+                <w:rFonts w:ascii="BRH Malayalam Extra" w:hAnsi="BRH Malayalam Extra" w:cs="BRH Devanagari Extra"/>
+                <w:b/>
+                <w:sz w:val="32"/>
+                <w:szCs w:val="40"/>
+              </w:rPr>
+              <w:t>–</w:t>
+            </w:r>
             <w:r>
               <w:rPr>
                 <w:rFonts w:ascii="BRH Devanagari Extra" w:hAnsi="BRH Devanagari Extra" w:cs="BRH Devanagari Extra"/>
@@ -6140,7 +6436,6 @@
               </w:rPr>
               <w:t>rÉ</w:t>
             </w:r>
-            <w:proofErr w:type="spellEnd"/>
             <w:r>
               <w:rPr>
                 <w:rFonts w:ascii="BRH Malayalam Extra" w:hAnsi="BRH Malayalam Extra" w:cs="BRH Devanagari Extra"/>
@@ -6416,19 +6711,8 @@
                 <w:sz w:val="28"/>
                 <w:szCs w:val="32"/>
               </w:rPr>
-              <w:t xml:space="preserve">T.S.6.5.8.4 – </w:t>
-            </w:r>
-            <w:proofErr w:type="spellStart"/>
-            <w:r>
-              <w:rPr>
-                <w:rFonts w:cs="Arial"/>
-                <w:b/>
-                <w:sz w:val="28"/>
-                <w:szCs w:val="32"/>
-              </w:rPr>
-              <w:t>Kramam</w:t>
-            </w:r>
-            <w:proofErr w:type="spellEnd"/>
+              <w:t>T.S.6.5.8.4 – Kramam</w:t>
+            </w:r>
           </w:p>
           <w:p>
             <w:pPr>
@@ -6553,28 +6837,17 @@
                 <w:sz w:val="40"/>
                 <w:szCs w:val="40"/>
               </w:rPr>
-              <w:t xml:space="preserve"> | </w:t>
-            </w:r>
-            <w:proofErr w:type="spellStart"/>
-            <w:r>
-              <w:rPr>
-                <w:rFonts w:ascii="BRH Devanagari Extra" w:hAnsi="BRH Devanagari Extra" w:cs="BRH Devanagari Extra"/>
-                <w:sz w:val="40"/>
-                <w:szCs w:val="40"/>
-              </w:rPr>
-              <w:t>eÉ</w:t>
-            </w:r>
-            <w:proofErr w:type="spellEnd"/>
-            <w:r>
-              <w:rPr>
-                <w:rFonts w:ascii="BRH Malayalam Extra" w:hAnsi="BRH Malayalam Extra" w:cs="BRH Devanagari Extra"/>
-                <w:b/>
-                <w:sz w:val="32"/>
-                <w:szCs w:val="40"/>
-              </w:rPr>
-              <w:t>–</w:t>
-            </w:r>
-            <w:proofErr w:type="spellStart"/>
+              <w:t xml:space="preserve"> | eÉ</w:t>
+            </w:r>
+            <w:r>
+              <w:rPr>
+                <w:rFonts w:ascii="BRH Malayalam Extra" w:hAnsi="BRH Malayalam Extra" w:cs="BRH Devanagari Extra"/>
+                <w:b/>
+                <w:sz w:val="32"/>
+                <w:szCs w:val="40"/>
+              </w:rPr>
+              <w:t>–</w:t>
+            </w:r>
             <w:r>
               <w:rPr>
                 <w:rFonts w:ascii="BRH Devanagari Extra" w:hAnsi="BRH Devanagari Extra" w:cs="BRH Devanagari Extra"/>
@@ -6583,17 +6856,15 @@
               </w:rPr>
               <w:t>lÉ</w:t>
             </w:r>
-            <w:proofErr w:type="spellEnd"/>
-            <w:r>
-              <w:rPr>
-                <w:rFonts w:ascii="BRH Malayalam Extra" w:hAnsi="BRH Malayalam Extra" w:cs="BRH Devanagari Extra"/>
-                <w:b/>
-                <w:sz w:val="32"/>
-                <w:szCs w:val="40"/>
-              </w:rPr>
-              <w:t>–</w:t>
-            </w:r>
-            <w:proofErr w:type="spellStart"/>
+            <w:r>
+              <w:rPr>
+                <w:rFonts w:ascii="BRH Malayalam Extra" w:hAnsi="BRH Malayalam Extra" w:cs="BRH Devanagari Extra"/>
+                <w:b/>
+                <w:sz w:val="32"/>
+                <w:szCs w:val="40"/>
+              </w:rPr>
+              <w:t>–</w:t>
+            </w:r>
             <w:r>
               <w:rPr>
                 <w:rFonts w:ascii="BRH Devanagari Extra" w:hAnsi="BRH Devanagari Extra" w:cs="BRH Devanagari Extra"/>
@@ -6602,7 +6873,6 @@
               </w:rPr>
               <w:t>rÉ</w:t>
             </w:r>
-            <w:proofErr w:type="spellEnd"/>
             <w:r>
               <w:rPr>
                 <w:rFonts w:ascii="BRH Malayalam Extra" w:hAnsi="BRH Malayalam Extra" w:cs="BRH Devanagari Extra"/>
@@ -6700,28 +6970,17 @@
                 <w:sz w:val="40"/>
                 <w:szCs w:val="40"/>
               </w:rPr>
-              <w:t xml:space="preserve"> | </w:t>
-            </w:r>
-            <w:proofErr w:type="spellStart"/>
-            <w:r>
-              <w:rPr>
-                <w:rFonts w:ascii="BRH Devanagari Extra" w:hAnsi="BRH Devanagari Extra" w:cs="BRH Devanagari Extra"/>
-                <w:sz w:val="40"/>
-                <w:szCs w:val="40"/>
-              </w:rPr>
-              <w:t>eÉ</w:t>
-            </w:r>
-            <w:proofErr w:type="spellEnd"/>
-            <w:r>
-              <w:rPr>
-                <w:rFonts w:ascii="BRH Malayalam Extra" w:hAnsi="BRH Malayalam Extra" w:cs="BRH Devanagari Extra"/>
-                <w:b/>
-                <w:sz w:val="32"/>
-                <w:szCs w:val="40"/>
-              </w:rPr>
-              <w:t>–</w:t>
-            </w:r>
-            <w:proofErr w:type="spellStart"/>
+              <w:t xml:space="preserve"> | eÉ</w:t>
+            </w:r>
+            <w:r>
+              <w:rPr>
+                <w:rFonts w:ascii="BRH Malayalam Extra" w:hAnsi="BRH Malayalam Extra" w:cs="BRH Devanagari Extra"/>
+                <w:b/>
+                <w:sz w:val="32"/>
+                <w:szCs w:val="40"/>
+              </w:rPr>
+              <w:t>–</w:t>
+            </w:r>
             <w:r>
               <w:rPr>
                 <w:rFonts w:ascii="BRH Devanagari Extra" w:hAnsi="BRH Devanagari Extra" w:cs="BRH Devanagari Extra"/>
@@ -6730,17 +6989,15 @@
               </w:rPr>
               <w:t>lÉ</w:t>
             </w:r>
-            <w:proofErr w:type="spellEnd"/>
-            <w:r>
-              <w:rPr>
-                <w:rFonts w:ascii="BRH Malayalam Extra" w:hAnsi="BRH Malayalam Extra" w:cs="BRH Devanagari Extra"/>
-                <w:b/>
-                <w:sz w:val="32"/>
-                <w:szCs w:val="40"/>
-              </w:rPr>
-              <w:t>–</w:t>
-            </w:r>
-            <w:proofErr w:type="spellStart"/>
+            <w:r>
+              <w:rPr>
+                <w:rFonts w:ascii="BRH Malayalam Extra" w:hAnsi="BRH Malayalam Extra" w:cs="BRH Devanagari Extra"/>
+                <w:b/>
+                <w:sz w:val="32"/>
+                <w:szCs w:val="40"/>
+              </w:rPr>
+              <w:t>–</w:t>
+            </w:r>
             <w:r>
               <w:rPr>
                 <w:rFonts w:ascii="BRH Devanagari Extra" w:hAnsi="BRH Devanagari Extra" w:cs="BRH Devanagari Extra"/>
@@ -6749,7 +7006,6 @@
               </w:rPr>
               <w:t>rÉ</w:t>
             </w:r>
-            <w:proofErr w:type="spellEnd"/>
             <w:r>
               <w:rPr>
                 <w:rFonts w:ascii="BRH Malayalam Extra" w:hAnsi="BRH Malayalam Extra" w:cs="BRH Devanagari Extra"/>
@@ -7018,7 +7274,6 @@
               </w:rPr>
               <w:t>–</w:t>
             </w:r>
-            <w:proofErr w:type="spellStart"/>
             <w:r>
               <w:rPr>
                 <w:rFonts w:ascii="BRH Devanagari Extra" w:hAnsi="BRH Devanagari Extra" w:cs="BRH Devanagari Extra"/>
@@ -7036,7 +7291,6 @@
               </w:rPr>
               <w:t>è</w:t>
             </w:r>
-            <w:proofErr w:type="spellEnd"/>
             <w:r>
               <w:rPr>
                 <w:rFonts w:ascii="BRH Malayalam Extra" w:hAnsi="BRH Malayalam Extra" w:cs="BRH Devanagari Extra"/>
@@ -7124,7 +7378,6 @@
               </w:rPr>
               <w:t>–</w:t>
             </w:r>
-            <w:proofErr w:type="spellStart"/>
             <w:r>
               <w:rPr>
                 <w:rFonts w:ascii="BRH Devanagari Extra" w:hAnsi="BRH Devanagari Extra" w:cs="BRH Devanagari Extra"/>
@@ -7134,7 +7387,6 @@
               </w:rPr>
               <w:t>óè</w:t>
             </w:r>
-            <w:proofErr w:type="spellEnd"/>
             <w:r>
               <w:rPr>
                 <w:rFonts w:ascii="BRH Malayalam Extra" w:hAnsi="BRH Malayalam Extra" w:cs="BRH Devanagari Extra"/>
@@ -7172,7 +7424,6 @@
               </w:rPr>
               <w:t>–</w:t>
             </w:r>
-            <w:proofErr w:type="spellStart"/>
             <w:r>
               <w:rPr>
                 <w:rFonts w:ascii="BRH Devanagari Extra" w:hAnsi="BRH Devanagari Extra" w:cs="BRH Devanagari Extra"/>
@@ -7181,7 +7432,6 @@
               </w:rPr>
               <w:t>óè</w:t>
             </w:r>
-            <w:proofErr w:type="spellEnd"/>
             <w:r>
               <w:rPr>
                 <w:rFonts w:ascii="BRH Malayalam Extra" w:hAnsi="BRH Malayalam Extra" w:cs="BRH Devanagari Extra"/>
@@ -7415,7 +7665,6 @@
               </w:rPr>
               <w:t>–</w:t>
             </w:r>
-            <w:proofErr w:type="spellStart"/>
             <w:r>
               <w:rPr>
                 <w:rFonts w:ascii="BRH Devanagari Extra" w:hAnsi="BRH Devanagari Extra" w:cs="BRH Devanagari Extra"/>
@@ -7424,7 +7673,6 @@
               </w:rPr>
               <w:t>óè</w:t>
             </w:r>
-            <w:proofErr w:type="spellEnd"/>
             <w:r>
               <w:rPr>
                 <w:rFonts w:ascii="BRH Malayalam Extra" w:hAnsi="BRH Malayalam Extra" w:cs="BRH Devanagari Extra"/>
@@ -7498,19 +7746,9 @@
                 <w:sz w:val="28"/>
                 <w:szCs w:val="32"/>
               </w:rPr>
-              <w:t xml:space="preserve">T.S.6.5.9.4 – </w:t>
-            </w:r>
-            <w:proofErr w:type="spellStart"/>
-            <w:r>
-              <w:rPr>
-                <w:rFonts w:cs="Arial"/>
-                <w:b/>
-                <w:sz w:val="28"/>
-                <w:szCs w:val="32"/>
-              </w:rPr>
-              <w:t>Kramam</w:t>
-            </w:r>
-            <w:proofErr w:type="spellEnd"/>
+              <w:lastRenderedPageBreak/>
+              <w:t>T.S.6.5.9.4 – Kramam</w:t>
+            </w:r>
           </w:p>
           <w:p>
             <w:pPr>
@@ -7529,41 +7767,13 @@
                 <w:szCs w:val="32"/>
               </w:rPr>
             </w:pPr>
-            <w:proofErr w:type="spellStart"/>
-            <w:r>
-              <w:rPr>
-                <w:rFonts w:cs="Arial"/>
-                <w:b/>
-                <w:szCs w:val="32"/>
-              </w:rPr>
-              <w:t>Krama</w:t>
-            </w:r>
-            <w:proofErr w:type="spellEnd"/>
-            <w:r>
-              <w:rPr>
-                <w:rFonts w:cs="Arial"/>
-                <w:b/>
-                <w:szCs w:val="32"/>
-              </w:rPr>
-              <w:t xml:space="preserve"> </w:t>
-            </w:r>
-            <w:proofErr w:type="spellStart"/>
-            <w:r>
-              <w:rPr>
-                <w:rFonts w:cs="Arial"/>
-                <w:b/>
-                <w:szCs w:val="32"/>
-              </w:rPr>
-              <w:t>Vaakyam</w:t>
-            </w:r>
-            <w:proofErr w:type="spellEnd"/>
-            <w:r>
-              <w:rPr>
-                <w:rFonts w:cs="Arial"/>
-                <w:b/>
-                <w:szCs w:val="32"/>
-              </w:rPr>
-              <w:t xml:space="preserve"> No.– 4 &amp; 5</w:t>
+            <w:r>
+              <w:rPr>
+                <w:rFonts w:cs="Arial"/>
+                <w:b/>
+                <w:szCs w:val="32"/>
+              </w:rPr>
+              <w:t>Krama Vaakyam No.– 4 &amp; 5</w:t>
             </w:r>
           </w:p>
           <w:p>
@@ -7584,25 +7794,14 @@
                 <w:szCs w:val="32"/>
               </w:rPr>
             </w:pPr>
-            <w:proofErr w:type="spellStart"/>
-            <w:r>
-              <w:rPr>
-                <w:rFonts w:cs="Arial"/>
-                <w:b/>
-                <w:sz w:val="28"/>
-                <w:szCs w:val="32"/>
-              </w:rPr>
-              <w:t>Panchaati</w:t>
-            </w:r>
-            <w:proofErr w:type="spellEnd"/>
-            <w:r>
-              <w:rPr>
-                <w:rFonts w:cs="Arial"/>
-                <w:b/>
-                <w:sz w:val="28"/>
-                <w:szCs w:val="32"/>
-              </w:rPr>
-              <w:t xml:space="preserve"> No</w:t>
+            <w:r>
+              <w:rPr>
+                <w:rFonts w:cs="Arial"/>
+                <w:b/>
+                <w:sz w:val="28"/>
+                <w:szCs w:val="32"/>
+              </w:rPr>
+              <w:t>Panchaati No</w:t>
             </w:r>
             <w:r>
               <w:rPr>
@@ -8040,19 +8239,8 @@
                 <w:sz w:val="28"/>
                 <w:szCs w:val="32"/>
               </w:rPr>
-              <w:t xml:space="preserve">T.S.6.5.11.4 – </w:t>
-            </w:r>
-            <w:proofErr w:type="spellStart"/>
-            <w:r>
-              <w:rPr>
-                <w:rFonts w:cs="Arial"/>
-                <w:b/>
-                <w:sz w:val="28"/>
-                <w:szCs w:val="32"/>
-              </w:rPr>
-              <w:t>Kramam</w:t>
-            </w:r>
-            <w:proofErr w:type="spellEnd"/>
+              <w:t>T.S.6.5.11.4 – Kramam</w:t>
+            </w:r>
           </w:p>
           <w:p>
             <w:pPr>
@@ -8072,45 +8260,14 @@
                 <w:szCs w:val="32"/>
               </w:rPr>
             </w:pPr>
-            <w:proofErr w:type="spellStart"/>
-            <w:r>
-              <w:rPr>
-                <w:rFonts w:cs="Arial"/>
-                <w:b/>
-                <w:sz w:val="28"/>
-                <w:szCs w:val="32"/>
-              </w:rPr>
-              <w:t>Krama</w:t>
-            </w:r>
-            <w:proofErr w:type="spellEnd"/>
-            <w:r>
-              <w:rPr>
-                <w:rFonts w:cs="Arial"/>
-                <w:b/>
-                <w:sz w:val="28"/>
-                <w:szCs w:val="32"/>
-              </w:rPr>
-              <w:t xml:space="preserve"> </w:t>
-            </w:r>
-            <w:proofErr w:type="spellStart"/>
-            <w:r>
-              <w:rPr>
-                <w:rFonts w:cs="Arial"/>
-                <w:b/>
-                <w:sz w:val="28"/>
-                <w:szCs w:val="32"/>
-              </w:rPr>
-              <w:t>Vaakyam</w:t>
-            </w:r>
-            <w:proofErr w:type="spellEnd"/>
-            <w:r>
-              <w:rPr>
-                <w:rFonts w:cs="Arial"/>
-                <w:b/>
-                <w:sz w:val="28"/>
-                <w:szCs w:val="32"/>
-              </w:rPr>
-              <w:t xml:space="preserve"> No.– 43</w:t>
+            <w:r>
+              <w:rPr>
+                <w:rFonts w:cs="Arial"/>
+                <w:b/>
+                <w:sz w:val="28"/>
+                <w:szCs w:val="32"/>
+              </w:rPr>
+              <w:t>Krama Vaakyam No.– 43</w:t>
             </w:r>
           </w:p>
           <w:p>
@@ -8131,25 +8288,14 @@
                 <w:szCs w:val="32"/>
               </w:rPr>
             </w:pPr>
-            <w:proofErr w:type="spellStart"/>
-            <w:r>
-              <w:rPr>
-                <w:rFonts w:cs="Arial"/>
-                <w:b/>
-                <w:sz w:val="28"/>
-                <w:szCs w:val="32"/>
-              </w:rPr>
-              <w:t>Panchaati</w:t>
-            </w:r>
-            <w:proofErr w:type="spellEnd"/>
-            <w:r>
-              <w:rPr>
-                <w:rFonts w:cs="Arial"/>
-                <w:b/>
-                <w:sz w:val="28"/>
-                <w:szCs w:val="32"/>
-              </w:rPr>
-              <w:t xml:space="preserve"> No</w:t>
+            <w:r>
+              <w:rPr>
+                <w:rFonts w:cs="Arial"/>
+                <w:b/>
+                <w:sz w:val="28"/>
+                <w:szCs w:val="32"/>
+              </w:rPr>
+              <w:t>Panchaati No</w:t>
             </w:r>
             <w:r>
               <w:rPr>
@@ -8235,7 +8381,6 @@
               </w:rPr>
               <w:t>–</w:t>
             </w:r>
-            <w:proofErr w:type="spellStart"/>
             <w:r>
               <w:rPr>
                 <w:rFonts w:ascii="BRH Devanagari Extra" w:hAnsi="BRH Devanagari Extra" w:cs="BRH Devanagari Extra"/>
@@ -8244,7 +8389,6 @@
               </w:rPr>
               <w:t>óè</w:t>
             </w:r>
-            <w:proofErr w:type="spellEnd"/>
             <w:r>
               <w:rPr>
                 <w:rFonts w:ascii="BRH Malayalam Extra" w:hAnsi="BRH Malayalam Extra" w:cs="BRH Devanagari Extra"/>
@@ -8354,7 +8498,6 @@
               </w:rPr>
               <w:t>–</w:t>
             </w:r>
-            <w:proofErr w:type="spellStart"/>
             <w:r>
               <w:rPr>
                 <w:rFonts w:ascii="BRH Devanagari Extra" w:hAnsi="BRH Devanagari Extra" w:cs="BRH Devanagari Extra"/>
@@ -8363,17 +8506,15 @@
               </w:rPr>
               <w:t>lÉ</w:t>
             </w:r>
-            <w:proofErr w:type="spellEnd"/>
-            <w:r>
-              <w:rPr>
-                <w:rFonts w:ascii="BRH Malayalam Extra" w:hAnsi="BRH Malayalam Extra" w:cs="BRH Devanagari Extra"/>
-                <w:b/>
-                <w:sz w:val="32"/>
-                <w:szCs w:val="40"/>
-              </w:rPr>
-              <w:t>–</w:t>
-            </w:r>
-            <w:proofErr w:type="spellStart"/>
+            <w:r>
+              <w:rPr>
+                <w:rFonts w:ascii="BRH Malayalam Extra" w:hAnsi="BRH Malayalam Extra" w:cs="BRH Devanagari Extra"/>
+                <w:b/>
+                <w:sz w:val="32"/>
+                <w:szCs w:val="40"/>
+              </w:rPr>
+              <w:t>–</w:t>
+            </w:r>
             <w:r>
               <w:rPr>
                 <w:rFonts w:ascii="BRH Devanagari Extra" w:hAnsi="BRH Devanagari Extra" w:cs="BRH Devanagari Extra"/>
@@ -8382,7 +8523,6 @@
               </w:rPr>
               <w:t>óè</w:t>
             </w:r>
-            <w:proofErr w:type="spellEnd"/>
             <w:r>
               <w:rPr>
                 <w:rFonts w:ascii="BRH Malayalam Extra" w:hAnsi="BRH Malayalam Extra" w:cs="BRH Devanagari Extra"/>
@@ -8605,8 +8745,6 @@
           <w:u w:val="single"/>
         </w:rPr>
       </w:pPr>
-      <w:bookmarkStart w:id="0" w:name="_GoBack"/>
-      <w:bookmarkEnd w:id="0"/>
     </w:p>
     <w:p>
       <w:pPr>
@@ -8627,7 +8765,6 @@
           <w:szCs w:val="32"/>
           <w:u w:val="single"/>
         </w:rPr>
-        <w:lastRenderedPageBreak/>
         <w:t xml:space="preserve">TS </w:t>
       </w:r>
       <w:r>
@@ -8797,12 +8934,16 @@
               <w:spacing w:before="0" w:line="240" w:lineRule="auto"/>
               <w:jc w:val="center"/>
               <w:rPr>
-                <w:sz w:val="32"/>
-                <w:szCs w:val="32"/>
-              </w:rPr>
-            </w:pPr>
-            <w:r>
-              <w:rPr>
+                <w:b/>
+                <w:bCs/>
+                <w:sz w:val="32"/>
+                <w:szCs w:val="32"/>
+              </w:rPr>
+            </w:pPr>
+            <w:r>
+              <w:rPr>
+                <w:b/>
+                <w:bCs/>
                 <w:sz w:val="32"/>
                 <w:szCs w:val="32"/>
               </w:rPr>
@@ -8814,12 +8955,16 @@
               <w:spacing w:before="0" w:line="240" w:lineRule="auto"/>
               <w:jc w:val="center"/>
               <w:rPr>
-                <w:sz w:val="32"/>
-                <w:szCs w:val="32"/>
-              </w:rPr>
-            </w:pPr>
-            <w:r>
-              <w:rPr>
+                <w:b/>
+                <w:bCs/>
+                <w:sz w:val="32"/>
+                <w:szCs w:val="32"/>
+              </w:rPr>
+            </w:pPr>
+            <w:r>
+              <w:rPr>
+                <w:b/>
+                <w:bCs/>
                 <w:sz w:val="32"/>
                 <w:szCs w:val="32"/>
               </w:rPr>
@@ -8836,12 +8981,16 @@
               <w:spacing w:before="0" w:line="240" w:lineRule="auto"/>
               <w:jc w:val="center"/>
               <w:rPr>
-                <w:sz w:val="32"/>
-                <w:szCs w:val="32"/>
-              </w:rPr>
-            </w:pPr>
-            <w:r>
-              <w:rPr>
+                <w:b/>
+                <w:bCs/>
+                <w:sz w:val="32"/>
+                <w:szCs w:val="32"/>
+              </w:rPr>
+            </w:pPr>
+            <w:r>
+              <w:rPr>
+                <w:b/>
+                <w:bCs/>
                 <w:sz w:val="32"/>
                 <w:szCs w:val="32"/>
               </w:rPr>
@@ -8859,12 +9008,16 @@
               <w:ind w:right="-18"/>
               <w:jc w:val="center"/>
               <w:rPr>
-                <w:sz w:val="32"/>
-                <w:szCs w:val="32"/>
-              </w:rPr>
-            </w:pPr>
-            <w:r>
-              <w:rPr>
+                <w:b/>
+                <w:bCs/>
+                <w:sz w:val="32"/>
+                <w:szCs w:val="32"/>
+              </w:rPr>
+            </w:pPr>
+            <w:r>
+              <w:rPr>
+                <w:b/>
+                <w:bCs/>
                 <w:sz w:val="32"/>
                 <w:szCs w:val="32"/>
               </w:rPr>
@@ -8998,7 +9151,7 @@
 </file>
 
 <file path=word/endnotes.xml><?xml version="1.0" encoding="utf-8"?>
-<w:endnotes xmlns:wpc="http://schemas.microsoft.com/office/word/2010/wordprocessingCanvas" xmlns:cx="http://schemas.microsoft.com/office/drawing/2014/chartex" xmlns:cx1="http://schemas.microsoft.com/office/drawing/2015/9/8/chartex" xmlns:mc="http://schemas.openxmlformats.org/markup-compatibility/2006" xmlns:o="urn:schemas-microsoft-com:office:office" xmlns:r="http://schemas.openxmlformats.org/officeDocument/2006/relationships" xmlns:m="http://schemas.openxmlformats.org/officeDocument/2006/math" xmlns:v="urn:schemas-microsoft-com:vml" xmlns:wp14="http://schemas.microsoft.com/office/word/2010/wordprocessingDrawing" xmlns:wp="http://schemas.openxmlformats.org/drawingml/2006/wordprocessingDrawing" xmlns:w10="urn:schemas-microsoft-com:office:word" xmlns:w="http://schemas.openxmlformats.org/wordprocessingml/2006/main" xmlns:w14="http://schemas.microsoft.com/office/word/2010/wordml" xmlns:w15="http://schemas.microsoft.com/office/word/2012/wordml" xmlns:w16se="http://schemas.microsoft.com/office/word/2015/wordml/symex" xmlns:wpg="http://schemas.microsoft.com/office/word/2010/wordprocessingGroup" xmlns:wpi="http://schemas.microsoft.com/office/word/2010/wordprocessingInk" xmlns:wne="http://schemas.microsoft.com/office/word/2006/wordml" xmlns:wps="http://schemas.microsoft.com/office/word/2010/wordprocessingShape" mc:Ignorable="w14 w15 w16se wp14">
+<w:endnotes xmlns:wpc="http://schemas.microsoft.com/office/word/2010/wordprocessingCanvas" xmlns:cx="http://schemas.microsoft.com/office/drawing/2014/chartex" xmlns:cx1="http://schemas.microsoft.com/office/drawing/2015/9/8/chartex" xmlns:cx2="http://schemas.microsoft.com/office/drawing/2015/10/21/chartex" xmlns:cx3="http://schemas.microsoft.com/office/drawing/2016/5/9/chartex" xmlns:cx4="http://schemas.microsoft.com/office/drawing/2016/5/10/chartex" xmlns:cx5="http://schemas.microsoft.com/office/drawing/2016/5/11/chartex" xmlns:cx6="http://schemas.microsoft.com/office/drawing/2016/5/12/chartex" xmlns:cx7="http://schemas.microsoft.com/office/drawing/2016/5/13/chartex" xmlns:cx8="http://schemas.microsoft.com/office/drawing/2016/5/14/chartex" xmlns:mc="http://schemas.openxmlformats.org/markup-compatibility/2006" xmlns:aink="http://schemas.microsoft.com/office/drawing/2016/ink" xmlns:am3d="http://schemas.microsoft.com/office/drawing/2017/model3d" xmlns:o="urn:schemas-microsoft-com:office:office" xmlns:oel="http://schemas.microsoft.com/office/2019/extlst" xmlns:r="http://schemas.openxmlformats.org/officeDocument/2006/relationships" xmlns:m="http://schemas.openxmlformats.org/officeDocument/2006/math" xmlns:v="urn:schemas-microsoft-com:vml" xmlns:wp14="http://schemas.microsoft.com/office/word/2010/wordprocessingDrawing" xmlns:wp="http://schemas.openxmlformats.org/drawingml/2006/wordprocessingDrawing" xmlns:w10="urn:schemas-microsoft-com:office:word" xmlns:w="http://schemas.openxmlformats.org/wordprocessingml/2006/main" xmlns:w14="http://schemas.microsoft.com/office/word/2010/wordml" xmlns:w15="http://schemas.microsoft.com/office/word/2012/wordml" xmlns:w16cex="http://schemas.microsoft.com/office/word/2018/wordml/cex" xmlns:w16cid="http://schemas.microsoft.com/office/word/2016/wordml/cid" xmlns:w16="http://schemas.microsoft.com/office/word/2018/wordml" xmlns:w16du="http://schemas.microsoft.com/office/word/2023/wordml/word16du" xmlns:w16sdtdh="http://schemas.microsoft.com/office/word/2020/wordml/sdtdatahash" xmlns:w16sdtfl="http://schemas.microsoft.com/office/word/2024/wordml/sdtformatlock" xmlns:w16se="http://schemas.microsoft.com/office/word/2015/wordml/symex" xmlns:wpg="http://schemas.microsoft.com/office/word/2010/wordprocessingGroup" xmlns:wpi="http://schemas.microsoft.com/office/word/2010/wordprocessingInk" xmlns:wne="http://schemas.microsoft.com/office/word/2006/wordml" xmlns:wps="http://schemas.microsoft.com/office/word/2010/wordprocessingShape" mc:Ignorable="w14 w15 w16se w16cid w16 w16cex w16sdtdh w16sdtfl w16du wp14">
   <w:endnote w:type="separator" w:id="-1">
     <w:p>
       <w:pPr>
@@ -9023,7 +9176,7 @@
 </file>
 
 <file path=word/footer1.xml><?xml version="1.0" encoding="utf-8"?>
-<w:ftr xmlns:wpc="http://schemas.microsoft.com/office/word/2010/wordprocessingCanvas" xmlns:cx="http://schemas.microsoft.com/office/drawing/2014/chartex" xmlns:cx1="http://schemas.microsoft.com/office/drawing/2015/9/8/chartex" xmlns:mc="http://schemas.openxmlformats.org/markup-compatibility/2006" xmlns:o="urn:schemas-microsoft-com:office:office" xmlns:r="http://schemas.openxmlformats.org/officeDocument/2006/relationships" xmlns:m="http://schemas.openxmlformats.org/officeDocument/2006/math" xmlns:v="urn:schemas-microsoft-com:vml" xmlns:wp14="http://schemas.microsoft.com/office/word/2010/wordprocessingDrawing" xmlns:wp="http://schemas.openxmlformats.org/drawingml/2006/wordprocessingDrawing" xmlns:w10="urn:schemas-microsoft-com:office:word" xmlns:w="http://schemas.openxmlformats.org/wordprocessingml/2006/main" xmlns:w14="http://schemas.microsoft.com/office/word/2010/wordml" xmlns:w15="http://schemas.microsoft.com/office/word/2012/wordml" xmlns:w16se="http://schemas.microsoft.com/office/word/2015/wordml/symex" xmlns:wpg="http://schemas.microsoft.com/office/word/2010/wordprocessingGroup" xmlns:wpi="http://schemas.microsoft.com/office/word/2010/wordprocessingInk" xmlns:wne="http://schemas.microsoft.com/office/word/2006/wordml" xmlns:wps="http://schemas.microsoft.com/office/word/2010/wordprocessingShape" mc:Ignorable="w14 w15 w16se wp14">
+<w:ftr xmlns:wpc="http://schemas.microsoft.com/office/word/2010/wordprocessingCanvas" xmlns:cx="http://schemas.microsoft.com/office/drawing/2014/chartex" xmlns:cx1="http://schemas.microsoft.com/office/drawing/2015/9/8/chartex" xmlns:cx2="http://schemas.microsoft.com/office/drawing/2015/10/21/chartex" xmlns:cx3="http://schemas.microsoft.com/office/drawing/2016/5/9/chartex" xmlns:cx4="http://schemas.microsoft.com/office/drawing/2016/5/10/chartex" xmlns:cx5="http://schemas.microsoft.com/office/drawing/2016/5/11/chartex" xmlns:cx6="http://schemas.microsoft.com/office/drawing/2016/5/12/chartex" xmlns:cx7="http://schemas.microsoft.com/office/drawing/2016/5/13/chartex" xmlns:cx8="http://schemas.microsoft.com/office/drawing/2016/5/14/chartex" xmlns:mc="http://schemas.openxmlformats.org/markup-compatibility/2006" xmlns:aink="http://schemas.microsoft.com/office/drawing/2016/ink" xmlns:am3d="http://schemas.microsoft.com/office/drawing/2017/model3d" xmlns:o="urn:schemas-microsoft-com:office:office" xmlns:oel="http://schemas.microsoft.com/office/2019/extlst" xmlns:r="http://schemas.openxmlformats.org/officeDocument/2006/relationships" xmlns:m="http://schemas.openxmlformats.org/officeDocument/2006/math" xmlns:v="urn:schemas-microsoft-com:vml" xmlns:wp14="http://schemas.microsoft.com/office/word/2010/wordprocessingDrawing" xmlns:wp="http://schemas.openxmlformats.org/drawingml/2006/wordprocessingDrawing" xmlns:w10="urn:schemas-microsoft-com:office:word" xmlns:w="http://schemas.openxmlformats.org/wordprocessingml/2006/main" xmlns:w14="http://schemas.microsoft.com/office/word/2010/wordml" xmlns:w15="http://schemas.microsoft.com/office/word/2012/wordml" xmlns:w16cex="http://schemas.microsoft.com/office/word/2018/wordml/cex" xmlns:w16cid="http://schemas.microsoft.com/office/word/2016/wordml/cid" xmlns:w16="http://schemas.microsoft.com/office/word/2018/wordml" xmlns:w16du="http://schemas.microsoft.com/office/word/2023/wordml/word16du" xmlns:w16sdtdh="http://schemas.microsoft.com/office/word/2020/wordml/sdtdatahash" xmlns:w16sdtfl="http://schemas.microsoft.com/office/word/2024/wordml/sdtformatlock" xmlns:w16se="http://schemas.microsoft.com/office/word/2015/wordml/symex" xmlns:wpg="http://schemas.microsoft.com/office/word/2010/wordprocessingGroup" xmlns:wpi="http://schemas.microsoft.com/office/word/2010/wordprocessingInk" xmlns:wne="http://schemas.microsoft.com/office/word/2006/wordml" xmlns:wps="http://schemas.microsoft.com/office/word/2010/wordprocessingShape" mc:Ignorable="w14 w15 w16se w16cid w16 w16cex w16sdtdh w16sdtfl w16du wp14">
   <w:p>
     <w:pPr>
       <w:pBdr>
@@ -9076,14 +9229,35 @@
         <w:bCs/>
       </w:rPr>
       <w:tab/>
-      <w:t xml:space="preserve">              v</w:t>
+      <w:t xml:space="preserve">              </w:t>
     </w:r>
     <w:r>
       <w:rPr>
         <w:b/>
         <w:bCs/>
       </w:rPr>
-      <w:t>edavms@gmail.com</w:t>
+      <w:t>www.</w:t>
+    </w:r>
+    <w:r>
+      <w:rPr>
+        <w:b/>
+        <w:bCs/>
+      </w:rPr>
+      <w:t>v</w:t>
+    </w:r>
+    <w:r>
+      <w:rPr>
+        <w:b/>
+        <w:bCs/>
+      </w:rPr>
+      <w:t>edavms</w:t>
+    </w:r>
+    <w:r>
+      <w:rPr>
+        <w:b/>
+        <w:bCs/>
+      </w:rPr>
+      <w:t>.in</w:t>
     </w:r>
     <w:r>
       <w:rPr>
@@ -9099,6 +9273,13 @@
       </w:rPr>
       <w:tab/>
       <w:t xml:space="preserve"> </w:t>
+    </w:r>
+    <w:r>
+      <w:rPr>
+        <w:b/>
+        <w:bCs/>
+      </w:rPr>
+      <w:t xml:space="preserve">                     </w:t>
     </w:r>
     <w:r>
       <w:tab/>
@@ -9205,7 +9386,7 @@
 </file>
 
 <file path=word/footer2.xml><?xml version="1.0" encoding="utf-8"?>
-<w:ftr xmlns:wpc="http://schemas.microsoft.com/office/word/2010/wordprocessingCanvas" xmlns:cx="http://schemas.microsoft.com/office/drawing/2014/chartex" xmlns:cx1="http://schemas.microsoft.com/office/drawing/2015/9/8/chartex" xmlns:mc="http://schemas.openxmlformats.org/markup-compatibility/2006" xmlns:o="urn:schemas-microsoft-com:office:office" xmlns:r="http://schemas.openxmlformats.org/officeDocument/2006/relationships" xmlns:m="http://schemas.openxmlformats.org/officeDocument/2006/math" xmlns:v="urn:schemas-microsoft-com:vml" xmlns:wp14="http://schemas.microsoft.com/office/word/2010/wordprocessingDrawing" xmlns:wp="http://schemas.openxmlformats.org/drawingml/2006/wordprocessingDrawing" xmlns:w10="urn:schemas-microsoft-com:office:word" xmlns:w="http://schemas.openxmlformats.org/wordprocessingml/2006/main" xmlns:w14="http://schemas.microsoft.com/office/word/2010/wordml" xmlns:w15="http://schemas.microsoft.com/office/word/2012/wordml" xmlns:w16se="http://schemas.microsoft.com/office/word/2015/wordml/symex" xmlns:wpg="http://schemas.microsoft.com/office/word/2010/wordprocessingGroup" xmlns:wpi="http://schemas.microsoft.com/office/word/2010/wordprocessingInk" xmlns:wne="http://schemas.microsoft.com/office/word/2006/wordml" xmlns:wps="http://schemas.microsoft.com/office/word/2010/wordprocessingShape" mc:Ignorable="w14 w15 w16se wp14">
+<w:ftr xmlns:wpc="http://schemas.microsoft.com/office/word/2010/wordprocessingCanvas" xmlns:cx="http://schemas.microsoft.com/office/drawing/2014/chartex" xmlns:cx1="http://schemas.microsoft.com/office/drawing/2015/9/8/chartex" xmlns:cx2="http://schemas.microsoft.com/office/drawing/2015/10/21/chartex" xmlns:cx3="http://schemas.microsoft.com/office/drawing/2016/5/9/chartex" xmlns:cx4="http://schemas.microsoft.com/office/drawing/2016/5/10/chartex" xmlns:cx5="http://schemas.microsoft.com/office/drawing/2016/5/11/chartex" xmlns:cx6="http://schemas.microsoft.com/office/drawing/2016/5/12/chartex" xmlns:cx7="http://schemas.microsoft.com/office/drawing/2016/5/13/chartex" xmlns:cx8="http://schemas.microsoft.com/office/drawing/2016/5/14/chartex" xmlns:mc="http://schemas.openxmlformats.org/markup-compatibility/2006" xmlns:aink="http://schemas.microsoft.com/office/drawing/2016/ink" xmlns:am3d="http://schemas.microsoft.com/office/drawing/2017/model3d" xmlns:o="urn:schemas-microsoft-com:office:office" xmlns:oel="http://schemas.microsoft.com/office/2019/extlst" xmlns:r="http://schemas.openxmlformats.org/officeDocument/2006/relationships" xmlns:m="http://schemas.openxmlformats.org/officeDocument/2006/math" xmlns:v="urn:schemas-microsoft-com:vml" xmlns:wp14="http://schemas.microsoft.com/office/word/2010/wordprocessingDrawing" xmlns:wp="http://schemas.openxmlformats.org/drawingml/2006/wordprocessingDrawing" xmlns:w10="urn:schemas-microsoft-com:office:word" xmlns:w="http://schemas.openxmlformats.org/wordprocessingml/2006/main" xmlns:w14="http://schemas.microsoft.com/office/word/2010/wordml" xmlns:w15="http://schemas.microsoft.com/office/word/2012/wordml" xmlns:w16cex="http://schemas.microsoft.com/office/word/2018/wordml/cex" xmlns:w16cid="http://schemas.microsoft.com/office/word/2016/wordml/cid" xmlns:w16="http://schemas.microsoft.com/office/word/2018/wordml" xmlns:w16du="http://schemas.microsoft.com/office/word/2023/wordml/word16du" xmlns:w16sdtdh="http://schemas.microsoft.com/office/word/2020/wordml/sdtdatahash" xmlns:w16sdtfl="http://schemas.microsoft.com/office/word/2024/wordml/sdtformatlock" xmlns:w16se="http://schemas.microsoft.com/office/word/2015/wordml/symex" xmlns:wpg="http://schemas.microsoft.com/office/word/2010/wordprocessingGroup" xmlns:wpi="http://schemas.microsoft.com/office/word/2010/wordprocessingInk" xmlns:wne="http://schemas.microsoft.com/office/word/2006/wordml" xmlns:wps="http://schemas.microsoft.com/office/word/2010/wordprocessingShape" mc:Ignorable="w14 w15 w16se w16cid w16 w16cex w16sdtdh w16sdtfl w16du wp14">
   <w:p>
     <w:pPr>
       <w:pBdr>
@@ -9293,7 +9474,13 @@
         <w:bCs/>
       </w:rPr>
       <w:tab/>
-      <w:t xml:space="preserve"> </w:t>
+    </w:r>
+    <w:r>
+      <w:rPr>
+        <w:b/>
+        <w:bCs/>
+      </w:rPr>
+      <w:t xml:space="preserve">                     </w:t>
     </w:r>
     <w:r>
       <w:tab/>
@@ -9408,7 +9595,7 @@
 </file>
 
 <file path=word/footnotes.xml><?xml version="1.0" encoding="utf-8"?>
-<w:footnotes xmlns:wpc="http://schemas.microsoft.com/office/word/2010/wordprocessingCanvas" xmlns:cx="http://schemas.microsoft.com/office/drawing/2014/chartex" xmlns:cx1="http://schemas.microsoft.com/office/drawing/2015/9/8/chartex" xmlns:mc="http://schemas.openxmlformats.org/markup-compatibility/2006" xmlns:o="urn:schemas-microsoft-com:office:office" xmlns:r="http://schemas.openxmlformats.org/officeDocument/2006/relationships" xmlns:m="http://schemas.openxmlformats.org/officeDocument/2006/math" xmlns:v="urn:schemas-microsoft-com:vml" xmlns:wp14="http://schemas.microsoft.com/office/word/2010/wordprocessingDrawing" xmlns:wp="http://schemas.openxmlformats.org/drawingml/2006/wordprocessingDrawing" xmlns:w10="urn:schemas-microsoft-com:office:word" xmlns:w="http://schemas.openxmlformats.org/wordprocessingml/2006/main" xmlns:w14="http://schemas.microsoft.com/office/word/2010/wordml" xmlns:w15="http://schemas.microsoft.com/office/word/2012/wordml" xmlns:w16se="http://schemas.microsoft.com/office/word/2015/wordml/symex" xmlns:wpg="http://schemas.microsoft.com/office/word/2010/wordprocessingGroup" xmlns:wpi="http://schemas.microsoft.com/office/word/2010/wordprocessingInk" xmlns:wne="http://schemas.microsoft.com/office/word/2006/wordml" xmlns:wps="http://schemas.microsoft.com/office/word/2010/wordprocessingShape" mc:Ignorable="w14 w15 w16se wp14">
+<w:footnotes xmlns:wpc="http://schemas.microsoft.com/office/word/2010/wordprocessingCanvas" xmlns:cx="http://schemas.microsoft.com/office/drawing/2014/chartex" xmlns:cx1="http://schemas.microsoft.com/office/drawing/2015/9/8/chartex" xmlns:cx2="http://schemas.microsoft.com/office/drawing/2015/10/21/chartex" xmlns:cx3="http://schemas.microsoft.com/office/drawing/2016/5/9/chartex" xmlns:cx4="http://schemas.microsoft.com/office/drawing/2016/5/10/chartex" xmlns:cx5="http://schemas.microsoft.com/office/drawing/2016/5/11/chartex" xmlns:cx6="http://schemas.microsoft.com/office/drawing/2016/5/12/chartex" xmlns:cx7="http://schemas.microsoft.com/office/drawing/2016/5/13/chartex" xmlns:cx8="http://schemas.microsoft.com/office/drawing/2016/5/14/chartex" xmlns:mc="http://schemas.openxmlformats.org/markup-compatibility/2006" xmlns:aink="http://schemas.microsoft.com/office/drawing/2016/ink" xmlns:am3d="http://schemas.microsoft.com/office/drawing/2017/model3d" xmlns:o="urn:schemas-microsoft-com:office:office" xmlns:oel="http://schemas.microsoft.com/office/2019/extlst" xmlns:r="http://schemas.openxmlformats.org/officeDocument/2006/relationships" xmlns:m="http://schemas.openxmlformats.org/officeDocument/2006/math" xmlns:v="urn:schemas-microsoft-com:vml" xmlns:wp14="http://schemas.microsoft.com/office/word/2010/wordprocessingDrawing" xmlns:wp="http://schemas.openxmlformats.org/drawingml/2006/wordprocessingDrawing" xmlns:w10="urn:schemas-microsoft-com:office:word" xmlns:w="http://schemas.openxmlformats.org/wordprocessingml/2006/main" xmlns:w14="http://schemas.microsoft.com/office/word/2010/wordml" xmlns:w15="http://schemas.microsoft.com/office/word/2012/wordml" xmlns:w16cex="http://schemas.microsoft.com/office/word/2018/wordml/cex" xmlns:w16cid="http://schemas.microsoft.com/office/word/2016/wordml/cid" xmlns:w16="http://schemas.microsoft.com/office/word/2018/wordml" xmlns:w16du="http://schemas.microsoft.com/office/word/2023/wordml/word16du" xmlns:w16sdtdh="http://schemas.microsoft.com/office/word/2020/wordml/sdtdatahash" xmlns:w16sdtfl="http://schemas.microsoft.com/office/word/2024/wordml/sdtformatlock" xmlns:w16se="http://schemas.microsoft.com/office/word/2015/wordml/symex" xmlns:wpg="http://schemas.microsoft.com/office/word/2010/wordprocessingGroup" xmlns:wpi="http://schemas.microsoft.com/office/word/2010/wordprocessingInk" xmlns:wne="http://schemas.microsoft.com/office/word/2006/wordml" xmlns:wps="http://schemas.microsoft.com/office/word/2010/wordprocessingShape" mc:Ignorable="w14 w15 w16se w16cid w16 w16cex w16sdtdh w16sdtfl w16du wp14">
   <w:footnote w:type="separator" w:id="-1">
     <w:p>
       <w:pPr>
@@ -9433,7 +9620,7 @@
 </file>
 
 <file path=word/header1.xml><?xml version="1.0" encoding="utf-8"?>
-<w:hdr xmlns:wpc="http://schemas.microsoft.com/office/word/2010/wordprocessingCanvas" xmlns:cx="http://schemas.microsoft.com/office/drawing/2014/chartex" xmlns:cx1="http://schemas.microsoft.com/office/drawing/2015/9/8/chartex" xmlns:mc="http://schemas.openxmlformats.org/markup-compatibility/2006" xmlns:o="urn:schemas-microsoft-com:office:office" xmlns:r="http://schemas.openxmlformats.org/officeDocument/2006/relationships" xmlns:m="http://schemas.openxmlformats.org/officeDocument/2006/math" xmlns:v="urn:schemas-microsoft-com:vml" xmlns:wp14="http://schemas.microsoft.com/office/word/2010/wordprocessingDrawing" xmlns:wp="http://schemas.openxmlformats.org/drawingml/2006/wordprocessingDrawing" xmlns:w10="urn:schemas-microsoft-com:office:word" xmlns:w="http://schemas.openxmlformats.org/wordprocessingml/2006/main" xmlns:w14="http://schemas.microsoft.com/office/word/2010/wordml" xmlns:w15="http://schemas.microsoft.com/office/word/2012/wordml" xmlns:w16se="http://schemas.microsoft.com/office/word/2015/wordml/symex" xmlns:wpg="http://schemas.microsoft.com/office/word/2010/wordprocessingGroup" xmlns:wpi="http://schemas.microsoft.com/office/word/2010/wordprocessingInk" xmlns:wne="http://schemas.microsoft.com/office/word/2006/wordml" xmlns:wps="http://schemas.microsoft.com/office/word/2010/wordprocessingShape" mc:Ignorable="w14 w15 w16se wp14">
+<w:hdr xmlns:wpc="http://schemas.microsoft.com/office/word/2010/wordprocessingCanvas" xmlns:cx="http://schemas.microsoft.com/office/drawing/2014/chartex" xmlns:cx1="http://schemas.microsoft.com/office/drawing/2015/9/8/chartex" xmlns:cx2="http://schemas.microsoft.com/office/drawing/2015/10/21/chartex" xmlns:cx3="http://schemas.microsoft.com/office/drawing/2016/5/9/chartex" xmlns:cx4="http://schemas.microsoft.com/office/drawing/2016/5/10/chartex" xmlns:cx5="http://schemas.microsoft.com/office/drawing/2016/5/11/chartex" xmlns:cx6="http://schemas.microsoft.com/office/drawing/2016/5/12/chartex" xmlns:cx7="http://schemas.microsoft.com/office/drawing/2016/5/13/chartex" xmlns:cx8="http://schemas.microsoft.com/office/drawing/2016/5/14/chartex" xmlns:mc="http://schemas.openxmlformats.org/markup-compatibility/2006" xmlns:aink="http://schemas.microsoft.com/office/drawing/2016/ink" xmlns:am3d="http://schemas.microsoft.com/office/drawing/2017/model3d" xmlns:o="urn:schemas-microsoft-com:office:office" xmlns:oel="http://schemas.microsoft.com/office/2019/extlst" xmlns:r="http://schemas.openxmlformats.org/officeDocument/2006/relationships" xmlns:m="http://schemas.openxmlformats.org/officeDocument/2006/math" xmlns:v="urn:schemas-microsoft-com:vml" xmlns:wp14="http://schemas.microsoft.com/office/word/2010/wordprocessingDrawing" xmlns:wp="http://schemas.openxmlformats.org/drawingml/2006/wordprocessingDrawing" xmlns:w10="urn:schemas-microsoft-com:office:word" xmlns:w="http://schemas.openxmlformats.org/wordprocessingml/2006/main" xmlns:w14="http://schemas.microsoft.com/office/word/2010/wordml" xmlns:w15="http://schemas.microsoft.com/office/word/2012/wordml" xmlns:w16cex="http://schemas.microsoft.com/office/word/2018/wordml/cex" xmlns:w16cid="http://schemas.microsoft.com/office/word/2016/wordml/cid" xmlns:w16="http://schemas.microsoft.com/office/word/2018/wordml" xmlns:w16du="http://schemas.microsoft.com/office/word/2023/wordml/word16du" xmlns:w16sdtdh="http://schemas.microsoft.com/office/word/2020/wordml/sdtdatahash" xmlns:w16sdtfl="http://schemas.microsoft.com/office/word/2024/wordml/sdtformatlock" xmlns:w16se="http://schemas.microsoft.com/office/word/2015/wordml/symex" xmlns:wpg="http://schemas.microsoft.com/office/word/2010/wordprocessingGroup" xmlns:wpi="http://schemas.microsoft.com/office/word/2010/wordprocessingInk" xmlns:wne="http://schemas.microsoft.com/office/word/2006/wordml" xmlns:wps="http://schemas.microsoft.com/office/word/2010/wordprocessingShape" mc:Ignorable="w14 w15 w16se w16cid w16 w16cex w16sdtdh w16sdtfl w16du wp14">
   <w:p>
     <w:pPr>
       <w:pStyle w:val="Header"/>
@@ -9446,7 +9633,7 @@
 </file>
 
 <file path=word/header2.xml><?xml version="1.0" encoding="utf-8"?>
-<w:hdr xmlns:wpc="http://schemas.microsoft.com/office/word/2010/wordprocessingCanvas" xmlns:cx="http://schemas.microsoft.com/office/drawing/2014/chartex" xmlns:cx1="http://schemas.microsoft.com/office/drawing/2015/9/8/chartex" xmlns:mc="http://schemas.openxmlformats.org/markup-compatibility/2006" xmlns:o="urn:schemas-microsoft-com:office:office" xmlns:r="http://schemas.openxmlformats.org/officeDocument/2006/relationships" xmlns:m="http://schemas.openxmlformats.org/officeDocument/2006/math" xmlns:v="urn:schemas-microsoft-com:vml" xmlns:wp14="http://schemas.microsoft.com/office/word/2010/wordprocessingDrawing" xmlns:wp="http://schemas.openxmlformats.org/drawingml/2006/wordprocessingDrawing" xmlns:w10="urn:schemas-microsoft-com:office:word" xmlns:w="http://schemas.openxmlformats.org/wordprocessingml/2006/main" xmlns:w14="http://schemas.microsoft.com/office/word/2010/wordml" xmlns:w15="http://schemas.microsoft.com/office/word/2012/wordml" xmlns:w16se="http://schemas.microsoft.com/office/word/2015/wordml/symex" xmlns:wpg="http://schemas.microsoft.com/office/word/2010/wordprocessingGroup" xmlns:wpi="http://schemas.microsoft.com/office/word/2010/wordprocessingInk" xmlns:wne="http://schemas.microsoft.com/office/word/2006/wordml" xmlns:wps="http://schemas.microsoft.com/office/word/2010/wordprocessingShape" mc:Ignorable="w14 w15 w16se wp14">
+<w:hdr xmlns:wpc="http://schemas.microsoft.com/office/word/2010/wordprocessingCanvas" xmlns:cx="http://schemas.microsoft.com/office/drawing/2014/chartex" xmlns:cx1="http://schemas.microsoft.com/office/drawing/2015/9/8/chartex" xmlns:cx2="http://schemas.microsoft.com/office/drawing/2015/10/21/chartex" xmlns:cx3="http://schemas.microsoft.com/office/drawing/2016/5/9/chartex" xmlns:cx4="http://schemas.microsoft.com/office/drawing/2016/5/10/chartex" xmlns:cx5="http://schemas.microsoft.com/office/drawing/2016/5/11/chartex" xmlns:cx6="http://schemas.microsoft.com/office/drawing/2016/5/12/chartex" xmlns:cx7="http://schemas.microsoft.com/office/drawing/2016/5/13/chartex" xmlns:cx8="http://schemas.microsoft.com/office/drawing/2016/5/14/chartex" xmlns:mc="http://schemas.openxmlformats.org/markup-compatibility/2006" xmlns:aink="http://schemas.microsoft.com/office/drawing/2016/ink" xmlns:am3d="http://schemas.microsoft.com/office/drawing/2017/model3d" xmlns:o="urn:schemas-microsoft-com:office:office" xmlns:oel="http://schemas.microsoft.com/office/2019/extlst" xmlns:r="http://schemas.openxmlformats.org/officeDocument/2006/relationships" xmlns:m="http://schemas.openxmlformats.org/officeDocument/2006/math" xmlns:v="urn:schemas-microsoft-com:vml" xmlns:wp14="http://schemas.microsoft.com/office/word/2010/wordprocessingDrawing" xmlns:wp="http://schemas.openxmlformats.org/drawingml/2006/wordprocessingDrawing" xmlns:w10="urn:schemas-microsoft-com:office:word" xmlns:w="http://schemas.openxmlformats.org/wordprocessingml/2006/main" xmlns:w14="http://schemas.microsoft.com/office/word/2010/wordml" xmlns:w15="http://schemas.microsoft.com/office/word/2012/wordml" xmlns:w16cex="http://schemas.microsoft.com/office/word/2018/wordml/cex" xmlns:w16cid="http://schemas.microsoft.com/office/word/2016/wordml/cid" xmlns:w16="http://schemas.microsoft.com/office/word/2018/wordml" xmlns:w16du="http://schemas.microsoft.com/office/word/2023/wordml/word16du" xmlns:w16sdtdh="http://schemas.microsoft.com/office/word/2020/wordml/sdtdatahash" xmlns:w16sdtfl="http://schemas.microsoft.com/office/word/2024/wordml/sdtformatlock" xmlns:w16se="http://schemas.microsoft.com/office/word/2015/wordml/symex" xmlns:wpg="http://schemas.microsoft.com/office/word/2010/wordprocessingGroup" xmlns:wpi="http://schemas.microsoft.com/office/word/2010/wordprocessingInk" xmlns:wne="http://schemas.microsoft.com/office/word/2006/wordml" xmlns:wps="http://schemas.microsoft.com/office/word/2010/wordprocessingShape" mc:Ignorable="w14 w15 w16se w16cid w16 w16cex w16sdtdh w16sdtfl w16du wp14">
   <w:p>
     <w:pPr>
       <w:pStyle w:val="Header"/>
@@ -9459,7 +9646,7 @@
 </file>
 
 <file path=word/styles.xml><?xml version="1.0" encoding="utf-8"?>
-<w:styles xmlns:mc="http://schemas.openxmlformats.org/markup-compatibility/2006" xmlns:r="http://schemas.openxmlformats.org/officeDocument/2006/relationships" xmlns:w="http://schemas.openxmlformats.org/wordprocessingml/2006/main" xmlns:w14="http://schemas.microsoft.com/office/word/2010/wordml" xmlns:w15="http://schemas.microsoft.com/office/word/2012/wordml" xmlns:w16se="http://schemas.microsoft.com/office/word/2015/wordml/symex" mc:Ignorable="w14 w15 w16se">
+<w:styles xmlns:mc="http://schemas.openxmlformats.org/markup-compatibility/2006" xmlns:r="http://schemas.openxmlformats.org/officeDocument/2006/relationships" xmlns:w="http://schemas.openxmlformats.org/wordprocessingml/2006/main" xmlns:w14="http://schemas.microsoft.com/office/word/2010/wordml" xmlns:w15="http://schemas.microsoft.com/office/word/2012/wordml" xmlns:w16cex="http://schemas.microsoft.com/office/word/2018/wordml/cex" xmlns:w16cid="http://schemas.microsoft.com/office/word/2016/wordml/cid" xmlns:w16="http://schemas.microsoft.com/office/word/2018/wordml" xmlns:w16du="http://schemas.microsoft.com/office/word/2023/wordml/word16du" xmlns:w16sdtdh="http://schemas.microsoft.com/office/word/2020/wordml/sdtdatahash" xmlns:w16sdtfl="http://schemas.microsoft.com/office/word/2024/wordml/sdtformatlock" xmlns:w16se="http://schemas.microsoft.com/office/word/2015/wordml/symex" mc:Ignorable="w14 w15 w16se w16cid w16 w16cex w16sdtdh w16sdtfl w16du">
   <w:docDefaults>
     <w:rPrDefault>
       <w:rPr>
@@ -9469,7 +9656,7 @@
     </w:rPrDefault>
     <w:pPrDefault/>
   </w:docDefaults>
-  <w:latentStyles w:defLockedState="0" w:defUIPriority="99" w:defSemiHidden="0" w:defUnhideWhenUsed="0" w:defQFormat="0" w:count="371">
+  <w:latentStyles w:defLockedState="0" w:defUIPriority="99" w:defSemiHidden="0" w:defUnhideWhenUsed="0" w:defQFormat="0" w:count="376">
     <w:lsdException w:name="Normal" w:uiPriority="0" w:qFormat="1"/>
     <w:lsdException w:name="heading 1" w:uiPriority="9" w:qFormat="1"/>
     <w:lsdException w:name="heading 2" w:semiHidden="1" w:uiPriority="9" w:unhideWhenUsed="1" w:qFormat="1"/>
@@ -9841,11 +10028,16 @@
     <w:lsdException w:name="List Table 5 Dark Accent 6" w:uiPriority="50"/>
     <w:lsdException w:name="List Table 6 Colorful Accent 6" w:uiPriority="51"/>
     <w:lsdException w:name="List Table 7 Colorful Accent 6" w:uiPriority="52"/>
+    <w:lsdException w:name="Mention" w:semiHidden="1" w:unhideWhenUsed="1"/>
+    <w:lsdException w:name="Smart Hyperlink" w:semiHidden="1" w:unhideWhenUsed="1"/>
+    <w:lsdException w:name="Hashtag" w:semiHidden="1" w:unhideWhenUsed="1"/>
+    <w:lsdException w:name="Unresolved Mention" w:semiHidden="1" w:unhideWhenUsed="1"/>
+    <w:lsdException w:name="Smart Link" w:semiHidden="1" w:unhideWhenUsed="1"/>
   </w:latentStyles>
   <w:style w:type="paragraph" w:default="1" w:styleId="Normal">
     <w:name w:val="Normal"/>
     <w:qFormat/>
-    <w:rsid w:val="00076C05"/>
+    <w:rsid w:val="008A1D45"/>
     <w:pPr>
       <w:spacing w:before="120" w:line="276" w:lineRule="auto"/>
     </w:pPr>

</xml_diff>